<commit_message>
Improve 3.2.6 presentation and vaardigheden with Harberger triangle graphs
- Rebuild presentation with embedded SVG graphs: VC surplus + Harberger
  triangle on combined graph+explanation slides (11 slides, cleaner layout)
- Improve uitleg vaardigheden docx with detailed Harberger explanation,
  surplus transfer warning, and expanded summary tables
- Add inline SVG Harberger graph to HTML variant, placed early in section
  so students see the visual before the stappenplan

Co-Authored-By: Claude Opus 4.6 (1M context) <noreply@anthropic.com>
</commit_message>
<xml_diff>
--- a/3.2 Hoofdstuk 2 - Marktvormen en hun marktevenwicht/3.2.6 Paragraaf 6 - Marktvormen en hun economische doelmatigheid/2. Leren/3.2.6 Marktvormen en hun economische doelmatigheid – uitleg vaardigheden.docx
+++ b/3.2 Hoofdstuk 2 - Marktvormen en hun marktevenwicht/3.2.6 Paragraaf 6 - Marktvormen en hun economische doelmatigheid/2. Leren/3.2.6 Marktvormen en hun economische doelmatigheid – uitleg vaardigheden.docx
@@ -155,7 +155,7 @@
                 <w:sz w:val="20"/>
                 <w:szCs w:val="20"/>
               </w:rPr>
-              <w:t xml:space="preserve">Grafisch</w:t>
+              <w:t xml:space="preserve">Overheid &amp; Handel</w:t>
             </w:r>
           </w:p>
         </w:tc>
@@ -169,7 +169,7 @@
     <w:p>
       <w:pPr>
         <w:pStyle w:val="Heading1"/>
-        <w:spacing w:after="200" w:before="0"/>
+        <w:spacing w:after="120" w:before="0"/>
       </w:pPr>
       <w:r>
         <w:rPr>
@@ -342,7 +342,7 @@
               <w:bottom w:val="single" w:color="E2E8F0" w:sz="1"/>
               <w:right w:val="single" w:color="E2E8F0" w:sz="1"/>
             </w:tcBorders>
-            <w:shd w:fill="E8F8F0" w:val="clear"/>
+            <w:shd w:fill="EBF5FB" w:val="clear"/>
             <w:tcMar>
               <w:top w:type="dxa" w:w="100"/>
               <w:left w:type="dxa" w:w="120"/>
@@ -360,7 +360,7 @@
                 <w:rFonts w:ascii="Arial" w:cs="Arial" w:eastAsia="Arial" w:hAnsi="Arial"/>
                 <w:b/>
                 <w:bCs/>
-                <w:color w:val="1E8449"/>
+                <w:color w:val="1A5276"/>
                 <w:sz w:val="22"/>
                 <w:szCs w:val="22"/>
               </w:rPr>
@@ -424,7 +424,7 @@
                 <w:sz w:val="20"/>
                 <w:szCs w:val="20"/>
               </w:rPr>
-              <w:t xml:space="preserve">Consumentensurplus in grafiek</w:t>
+              <w:t xml:space="preserve">Consumentensurplus in een V/A-diagram aanwijzen en berekenen</w:t>
             </w:r>
           </w:p>
         </w:tc>
@@ -437,7 +437,7 @@
               <w:bottom w:val="single" w:color="E2E8F0" w:sz="1"/>
               <w:right w:val="single" w:color="E2E8F0" w:sz="1"/>
             </w:tcBorders>
-            <w:shd w:fill="E8F8F0" w:val="clear"/>
+            <w:shd w:fill="EBF5FB" w:val="clear"/>
             <w:tcMar>
               <w:top w:type="dxa" w:w="100"/>
               <w:left w:type="dxa" w:w="120"/>
@@ -455,11 +455,11 @@
                 <w:rFonts w:ascii="Arial" w:cs="Arial" w:eastAsia="Arial" w:hAnsi="Arial"/>
                 <w:b/>
                 <w:bCs/>
-                <w:color w:val="1E8449"/>
+                <w:color w:val="1A5276"/>
                 <w:sz w:val="18"/>
                 <w:szCs w:val="18"/>
               </w:rPr>
-              <w:t xml:space="preserve">Grafisch</w:t>
+              <w:t xml:space="preserve">Marktanalyse</w:t>
             </w:r>
           </w:p>
         </w:tc>
@@ -474,7 +474,7 @@
               <w:bottom w:val="single" w:color="E2E8F0" w:sz="1"/>
               <w:right w:val="single" w:color="E2E8F0" w:sz="1"/>
             </w:tcBorders>
-            <w:shd w:fill="E8F8F0" w:val="clear"/>
+            <w:shd w:fill="EBF5FB" w:val="clear"/>
             <w:tcMar>
               <w:top w:type="dxa" w:w="100"/>
               <w:left w:type="dxa" w:w="120"/>
@@ -492,7 +492,7 @@
                 <w:rFonts w:ascii="Arial" w:cs="Arial" w:eastAsia="Arial" w:hAnsi="Arial"/>
                 <w:b/>
                 <w:bCs/>
-                <w:color w:val="1E8449"/>
+                <w:color w:val="1A5276"/>
                 <w:sz w:val="22"/>
                 <w:szCs w:val="22"/>
               </w:rPr>
@@ -556,7 +556,7 @@
                 <w:sz w:val="20"/>
                 <w:szCs w:val="20"/>
               </w:rPr>
-              <w:t xml:space="preserve">Producentensurplus in grafiek</w:t>
+              <w:t xml:space="preserve">Producentensurplus in een V/A-diagram aanwijzen en berekenen</w:t>
             </w:r>
           </w:p>
         </w:tc>
@@ -569,7 +569,7 @@
               <w:bottom w:val="single" w:color="E2E8F0" w:sz="1"/>
               <w:right w:val="single" w:color="E2E8F0" w:sz="1"/>
             </w:tcBorders>
-            <w:shd w:fill="E8F8F0" w:val="clear"/>
+            <w:shd w:fill="EBF5FB" w:val="clear"/>
             <w:tcMar>
               <w:top w:type="dxa" w:w="100"/>
               <w:left w:type="dxa" w:w="120"/>
@@ -587,11 +587,11 @@
                 <w:rFonts w:ascii="Arial" w:cs="Arial" w:eastAsia="Arial" w:hAnsi="Arial"/>
                 <w:b/>
                 <w:bCs/>
-                <w:color w:val="1E8449"/>
+                <w:color w:val="1A5276"/>
                 <w:sz w:val="18"/>
                 <w:szCs w:val="18"/>
               </w:rPr>
-              <w:t xml:space="preserve">Grafisch</w:t>
+              <w:t xml:space="preserve">Marktanalyse</w:t>
             </w:r>
           </w:p>
         </w:tc>
@@ -659,7 +659,7 @@
                 <w:sz w:val="21"/>
                 <w:szCs w:val="21"/>
               </w:rPr>
-              <w:t xml:space="preserve">Harbergerdriehoek herkennen</w:t>
+              <w:t xml:space="preserve">Harbergerdriehoek berekenen</w:t>
             </w:r>
           </w:p>
         </w:tc>
@@ -688,7 +688,7 @@
                 <w:sz w:val="20"/>
                 <w:szCs w:val="20"/>
               </w:rPr>
-              <w:t xml:space="preserve">Deadweight loss bij monopolie</w:t>
+              <w:t xml:space="preserve">Welvaartsverlies bij monopolie bepalen en verklaren</w:t>
             </w:r>
           </w:p>
         </w:tc>
@@ -820,7 +820,7 @@
                 <w:sz w:val="20"/>
                 <w:szCs w:val="20"/>
               </w:rPr>
-              <w:t xml:space="preserve">TS bij VC vs. monopolie</w:t>
+              <w:t xml:space="preserve">TS bij VC en monopolie vergelijken</w:t>
             </w:r>
           </w:p>
         </w:tc>
@@ -952,7 +952,7 @@
                 <w:sz w:val="20"/>
                 <w:szCs w:val="20"/>
               </w:rPr>
-              <w:t xml:space="preserve">P = MK als criterium</w:t>
+              <w:t xml:space="preserve">Is een markt efficiënt? P = MK als criterium</w:t>
             </w:r>
           </w:p>
         </w:tc>
@@ -1084,7 +1084,7 @@
                 <w:sz w:val="20"/>
                 <w:szCs w:val="20"/>
               </w:rPr>
-              <w:t xml:space="preserve">Individuele voor- en nadelen</w:t>
+              <w:t xml:space="preserve">Pareto-verbetering en Pareto-efficiëntie herkennen</w:t>
             </w:r>
           </w:p>
         </w:tc>
@@ -1151,12 +1151,12 @@
           <w:tcPr>
             <w:tcW w:type="dxa" w:w="600"/>
             <w:tcBorders>
-              <w:top w:val="single" w:color="1E8449" w:sz="1"/>
-              <w:left w:val="single" w:color="1E8449" w:sz="1"/>
-              <w:bottom w:val="single" w:color="1E8449" w:sz="1"/>
-              <w:right w:val="none" w:color="1E8449" w:sz="0"/>
-            </w:tcBorders>
-            <w:shd w:fill="1E8449" w:val="clear"/>
+              <w:top w:val="single" w:color="1A5276" w:sz="1"/>
+              <w:left w:val="single" w:color="1A5276" w:sz="1"/>
+              <w:bottom w:val="single" w:color="1A5276" w:sz="1"/>
+              <w:right w:val="none" w:color="1A5276" w:sz="0"/>
+            </w:tcBorders>
+            <w:shd w:fill="1A5276" w:val="clear"/>
             <w:tcMar>
               <w:top w:type="dxa" w:w="140"/>
               <w:left w:type="dxa" w:w="120"/>
@@ -1186,12 +1186,12 @@
           <w:tcPr>
             <w:tcW w:type="dxa" w:w="8426"/>
             <w:tcBorders>
-              <w:top w:val="single" w:color="1E8449" w:sz="1"/>
-              <w:left w:val="none" w:color="1E8449" w:sz="0"/>
-              <w:bottom w:val="single" w:color="1E8449" w:sz="1"/>
-              <w:right w:val="single" w:color="1E8449" w:sz="1"/>
-            </w:tcBorders>
-            <w:shd w:fill="E8F8F0" w:val="clear"/>
+              <w:top w:val="single" w:color="1A5276" w:sz="1"/>
+              <w:left w:val="none" w:color="1A5276" w:sz="0"/>
+              <w:bottom w:val="single" w:color="1A5276" w:sz="1"/>
+              <w:right w:val="single" w:color="1A5276" w:sz="1"/>
+            </w:tcBorders>
+            <w:shd w:fill="EBF5FB" w:val="clear"/>
             <w:tcMar>
               <w:top w:type="dxa" w:w="140"/>
               <w:left w:type="dxa" w:w="200"/>
@@ -1206,7 +1206,7 @@
                 <w:rFonts w:ascii="Arial" w:cs="Arial" w:eastAsia="Arial" w:hAnsi="Arial"/>
                 <w:b/>
                 <w:bCs/>
-                <w:color w:val="186A3B"/>
+                <w:color w:val="154360"/>
                 <w:sz w:val="28"/>
                 <w:szCs w:val="28"/>
               </w:rPr>
@@ -1222,11 +1222,11 @@
                 <w:rFonts w:ascii="Arial" w:cs="Arial" w:eastAsia="Arial" w:hAnsi="Arial"/>
                 <w:i/>
                 <w:iCs/>
-                <w:color w:val="1E8449"/>
+                <w:color w:val="1A5276"/>
                 <w:sz w:val="18"/>
                 <w:szCs w:val="18"/>
               </w:rPr>
-              <w:t xml:space="preserve">Grafisch</w:t>
+              <w:t xml:space="preserve">Marktanalyse</w:t>
             </w:r>
           </w:p>
         </w:tc>
@@ -1247,7 +1247,7 @@
           <w:rFonts w:ascii="Arial" w:cs="Arial" w:eastAsia="Arial" w:hAnsi="Arial"/>
           <w:b/>
           <w:bCs/>
-          <w:color w:val="1E8449"/>
+          <w:color w:val="1A5276"/>
           <w:sz w:val="24"/>
           <w:szCs w:val="24"/>
         </w:rPr>
@@ -1297,7 +1297,7 @@
           <w:rFonts w:ascii="Arial" w:cs="Arial" w:eastAsia="Arial" w:hAnsi="Arial"/>
           <w:b/>
           <w:bCs/>
-          <w:color w:val="1E8449"/>
+          <w:color w:val="1A5276"/>
           <w:sz w:val="24"/>
           <w:szCs w:val="24"/>
         </w:rPr>
@@ -1325,7 +1325,7 @@
             <w:tcW w:type="dxa" w:w="9026"/>
             <w:tcBorders>
               <w:top w:val="single" w:color="CBD5E0" w:sz="1"/>
-              <w:left w:val="single" w:color="1E8449" w:sz="8"/>
+              <w:left w:val="single" w:color="1A5276" w:sz="8"/>
               <w:bottom w:val="single" w:color="CBD5E0" w:sz="1"/>
               <w:right w:val="single" w:color="CBD5E0" w:sz="1"/>
             </w:tcBorders>
@@ -1348,7 +1348,7 @@
                 <w:sz w:val="22"/>
                 <w:szCs w:val="22"/>
               </w:rPr>
-              <w:t xml:space="preserve">Stap 1: Zoek de evenwichtsprijs (P*) in de grafiek</w:t>
+              <w:t xml:space="preserve">Stap 1: Zoek de evenwichtsprijs (P*) en -hoeveelheid (Q*)</w:t>
             </w:r>
           </w:p>
           <w:p>
@@ -1362,7 +1362,7 @@
                 <w:sz w:val="22"/>
                 <w:szCs w:val="22"/>
               </w:rPr>
-              <w:t xml:space="preserve">Stap 2: Zoek het snijpunt van V met de y-as (= max. betalingsbereidheid)</w:t>
+              <w:t xml:space="preserve">Stap 2: Zoek het snijpunt van de vraaglijn met de P-as (= maximale betalingsbereidheid)</w:t>
             </w:r>
           </w:p>
           <w:p>
@@ -1376,7 +1376,7 @@
                 <w:sz w:val="22"/>
                 <w:szCs w:val="22"/>
               </w:rPr>
-              <w:t xml:space="preserve">Stap 3: CS = driehoek tussen V-lijn, P*-lijn en y-as</w:t>
+              <w:t xml:space="preserve">Stap 3: Arceer de driehoek: boven P*, onder V, van Q = 0 tot Q*</w:t>
             </w:r>
           </w:p>
           <w:p>
@@ -1390,7 +1390,7 @@
                 <w:sz w:val="22"/>
                 <w:szCs w:val="22"/>
               </w:rPr>
-              <w:t xml:space="preserve">Stap 4: CS = ½ × Q* × (P_max − P*)</w:t>
+              <w:t xml:space="preserve">Stap 4: Bereken: CS = ½ × Q* × (P_max − P*)</w:t>
             </w:r>
           </w:p>
         </w:tc>
@@ -1411,7 +1411,7 @@
           <w:rFonts w:ascii="Arial" w:cs="Arial" w:eastAsia="Arial" w:hAnsi="Arial"/>
           <w:b/>
           <w:bCs/>
-          <w:color w:val="1E8449"/>
+          <w:color w:val="1A5276"/>
           <w:sz w:val="24"/>
           <w:szCs w:val="24"/>
         </w:rPr>
@@ -1429,13 +1429,8 @@
           <w:sz w:val="22"/>
           <w:szCs w:val="22"/>
         </w:rPr>
-        <w:t xml:space="preserve">Bij volkomen concurrentie: V: P = −Q + 60, A: P = Q. Evenwicht: Q* = 30, P* = 30.</w:t>
-      </w:r>
-    </w:p>
-    <w:p>
-      <w:pPr>
-        <w:spacing w:after="40"/>
-      </w:pPr>
+        <w:t xml:space="preserve">Bij volkomen concurrentie: V: P = −60 + Q, A: P = Q. Evenwicht: Q* = 30, P* = 30.</w:t>
+      </w:r>
     </w:p>
     <w:tbl>
       <w:tblPr>
@@ -1458,7 +1453,7 @@
             <w:tcW w:type="dxa" w:w="9026"/>
             <w:tcBorders>
               <w:top w:val="single" w:color="CBD5E0" w:sz="1"/>
-              <w:left w:val="single" w:color="1E8449" w:sz="8"/>
+              <w:left w:val="single" w:color="1A5276" w:sz="8"/>
               <w:bottom w:val="single" w:color="CBD5E0" w:sz="1"/>
               <w:right w:val="single" w:color="CBD5E0" w:sz="1"/>
             </w:tcBorders>
@@ -1481,7 +1476,35 @@
                 <w:sz w:val="22"/>
                 <w:szCs w:val="22"/>
               </w:rPr>
-              <w:t xml:space="preserve">CS = ½ × 30 × (60 − 30) = ½ × 30 × 30 = 450</w:t>
+              <w:t xml:space="preserve">P_max = 60 (snijpunt V met P-as, bij Q = 0)</w:t>
+            </w:r>
+          </w:p>
+          <w:p>
+            <w:pPr>
+              <w:spacing w:after="60"/>
+            </w:pPr>
+            <w:r>
+              <w:rPr>
+                <w:rFonts w:ascii="Consolas" w:cs="Consolas" w:eastAsia="Consolas" w:hAnsi="Consolas"/>
+                <w:color w:val="2D3748"/>
+                <w:sz w:val="22"/>
+                <w:szCs w:val="22"/>
+              </w:rPr>
+              <w:t xml:space="preserve">CS = ½ × 30 × (60 − 30)</w:t>
+            </w:r>
+          </w:p>
+          <w:p>
+            <w:pPr>
+              <w:spacing w:after="60"/>
+            </w:pPr>
+            <w:r>
+              <w:rPr>
+                <w:rFonts w:ascii="Consolas" w:cs="Consolas" w:eastAsia="Consolas" w:hAnsi="Consolas"/>
+                <w:color w:val="2D3748"/>
+                <w:sz w:val="22"/>
+                <w:szCs w:val="22"/>
+              </w:rPr>
+              <w:t xml:space="preserve">CS = ½ × 30 × 30 = 450</w:t>
             </w:r>
           </w:p>
         </w:tc>
@@ -1489,7 +1512,7 @@
     </w:tbl>
     <w:p>
       <w:pPr>
-        <w:spacing w:after="60"/>
+        <w:spacing w:after="40"/>
       </w:pPr>
     </w:p>
     <w:tbl>
@@ -1512,12 +1535,12 @@
           <w:tcPr>
             <w:tcW w:type="dxa" w:w="9026"/>
             <w:tcBorders>
-              <w:top w:val="single" w:color="FEF5E7" w:sz="1"/>
-              <w:left w:val="single" w:color="E67E22" w:sz="12"/>
-              <w:bottom w:val="single" w:color="FEF5E7" w:sz="1"/>
-              <w:right w:val="single" w:color="FEF5E7" w:sz="1"/>
-            </w:tcBorders>
-            <w:shd w:fill="FEF5E7" w:val="clear"/>
+              <w:top w:val="single" w:color="EBF5FB" w:sz="1"/>
+              <w:left w:val="single" w:color="1A5276" w:sz="12"/>
+              <w:bottom w:val="single" w:color="EBF5FB" w:sz="1"/>
+              <w:right w:val="single" w:color="EBF5FB" w:sz="1"/>
+            </w:tcBorders>
+            <w:shd w:fill="EBF5FB" w:val="clear"/>
             <w:tcMar>
               <w:top w:type="dxa" w:w="120"/>
               <w:left w:type="dxa" w:w="200"/>
@@ -1531,20 +1554,20 @@
                 <w:rFonts w:ascii="Arial" w:cs="Arial" w:eastAsia="Arial" w:hAnsi="Arial"/>
                 <w:b/>
                 <w:bCs/>
-                <w:color w:val="E67E22"/>
-                <w:sz w:val="22"/>
-                <w:szCs w:val="22"/>
-              </w:rPr>
-              <w:t xml:space="preserve">⭐ Kernregel: </w:t>
-            </w:r>
-            <w:r>
-              <w:rPr>
-                <w:rFonts w:ascii="Arial" w:cs="Arial" w:eastAsia="Arial" w:hAnsi="Arial"/>
-                <w:color w:val="2D3748"/>
-                <w:sz w:val="22"/>
-                <w:szCs w:val="22"/>
-              </w:rPr>
-              <w:t xml:space="preserve">Het CS is altijd een driehoek bóven de prijs en onder de vraaglijn. Hoe lager de prijs, hoe groter het CS.</w:t>
+                <w:color w:val="1A5276"/>
+                <w:sz w:val="22"/>
+                <w:szCs w:val="22"/>
+              </w:rPr>
+              <w:t xml:space="preserve">✨ Tip: </w:t>
+            </w:r>
+            <w:r>
+              <w:rPr>
+                <w:rFonts w:ascii="Arial" w:cs="Arial" w:eastAsia="Arial" w:hAnsi="Arial"/>
+                <w:color w:val="2D3748"/>
+                <w:sz w:val="22"/>
+                <w:szCs w:val="22"/>
+              </w:rPr>
+              <w:t xml:space="preserve">CS is altijd een driehoek bij een lineaire vraaglijn. Gebruik de formule ½ × basis × hoogte.</w:t>
             </w:r>
           </w:p>
         </w:tc>
@@ -1552,133 +1575,7 @@
     </w:tbl>
     <w:p>
       <w:pPr>
-        <w:spacing w:after="60"/>
-      </w:pPr>
-    </w:p>
-    <w:tbl>
-      <w:tblPr>
-        <w:tblW w:type="dxa" w:w="9026"/>
-        <w:tblBorders>
-          <w:top w:val="single" w:color="auto" w:sz="4"/>
-          <w:left w:val="single" w:color="auto" w:sz="4"/>
-          <w:bottom w:val="single" w:color="auto" w:sz="4"/>
-          <w:right w:val="single" w:color="auto" w:sz="4"/>
-          <w:insideH w:val="single" w:color="auto" w:sz="4"/>
-          <w:insideV w:val="single" w:color="auto" w:sz="4"/>
-        </w:tblBorders>
-      </w:tblPr>
-      <w:tblGrid>
-        <w:gridCol w:w="9026"/>
-      </w:tblGrid>
-      <w:tr>
-        <w:tc>
-          <w:tcPr>
-            <w:tcW w:type="dxa" w:w="9026"/>
-            <w:tcBorders>
-              <w:top w:val="single" w:color="EBF5FB" w:sz="1"/>
-              <w:left w:val="single" w:color="1A5276" w:sz="12"/>
-              <w:bottom w:val="single" w:color="EBF5FB" w:sz="1"/>
-              <w:right w:val="single" w:color="EBF5FB" w:sz="1"/>
-            </w:tcBorders>
-            <w:shd w:fill="EBF5FB" w:val="clear"/>
-            <w:tcMar>
-              <w:top w:type="dxa" w:w="120"/>
-              <w:left w:type="dxa" w:w="200"/>
-              <w:bottom w:type="dxa" w:w="120"/>
-              <w:right w:type="dxa" w:w="200"/>
-            </w:tcMar>
-          </w:tcPr>
-          <w:p>
-            <w:r>
-              <w:rPr>
-                <w:rFonts w:ascii="Arial" w:cs="Arial" w:eastAsia="Arial" w:hAnsi="Arial"/>
-                <w:b/>
-                <w:bCs/>
-                <w:color w:val="1A5276"/>
-                <w:sz w:val="22"/>
-                <w:szCs w:val="22"/>
-              </w:rPr>
-              <w:t xml:space="preserve">✨ Tip: </w:t>
-            </w:r>
-            <w:r>
-              <w:rPr>
-                <w:rFonts w:ascii="Arial" w:cs="Arial" w:eastAsia="Arial" w:hAnsi="Arial"/>
-                <w:color w:val="2D3748"/>
-                <w:sz w:val="22"/>
-                <w:szCs w:val="22"/>
-              </w:rPr>
-              <w:t xml:space="preserve">Hoe lager de prijs, hoe groter het CS. Bij volkomen concurrentie is het CS daarom groter dan bij monopolie.</w:t>
-            </w:r>
-          </w:p>
-        </w:tc>
-      </w:tr>
-    </w:tbl>
-    <w:p>
-      <w:pPr>
-        <w:spacing w:after="60"/>
-      </w:pPr>
-    </w:p>
-    <w:tbl>
-      <w:tblPr>
-        <w:tblW w:type="dxa" w:w="9026"/>
-        <w:tblBorders>
-          <w:top w:val="single" w:color="auto" w:sz="4"/>
-          <w:left w:val="single" w:color="auto" w:sz="4"/>
-          <w:bottom w:val="single" w:color="auto" w:sz="4"/>
-          <w:right w:val="single" w:color="auto" w:sz="4"/>
-          <w:insideH w:val="single" w:color="auto" w:sz="4"/>
-          <w:insideV w:val="single" w:color="auto" w:sz="4"/>
-        </w:tblBorders>
-      </w:tblPr>
-      <w:tblGrid>
-        <w:gridCol w:w="9026"/>
-      </w:tblGrid>
-      <w:tr>
-        <w:tc>
-          <w:tcPr>
-            <w:tcW w:type="dxa" w:w="9026"/>
-            <w:tcBorders>
-              <w:top w:val="single" w:color="E8F5E9" w:sz="1"/>
-              <w:left w:val="single" w:color="1E8449" w:sz="12"/>
-              <w:bottom w:val="single" w:color="E8F5E9" w:sz="1"/>
-              <w:right w:val="single" w:color="E8F5E9" w:sz="1"/>
-            </w:tcBorders>
-            <w:shd w:fill="E8F5E9" w:val="clear"/>
-            <w:tcMar>
-              <w:top w:type="dxa" w:w="120"/>
-              <w:left w:type="dxa" w:w="200"/>
-              <w:bottom w:type="dxa" w:w="120"/>
-              <w:right w:type="dxa" w:w="200"/>
-            </w:tcMar>
-          </w:tcPr>
-          <w:p>
-            <w:r>
-              <w:rPr>
-                <w:rFonts w:ascii="Arial" w:cs="Arial" w:eastAsia="Arial" w:hAnsi="Arial"/>
-                <w:b/>
-                <w:bCs/>
-                <w:color w:val="1E8449"/>
-                <w:sz w:val="22"/>
-                <w:szCs w:val="22"/>
-              </w:rPr>
-              <w:t xml:space="preserve">✅ Controle: </w:t>
-            </w:r>
-            <w:r>
-              <w:rPr>
-                <w:rFonts w:ascii="Arial" w:cs="Arial" w:eastAsia="Arial" w:hAnsi="Arial"/>
-                <w:color w:val="2D3748"/>
-                <w:sz w:val="22"/>
-                <w:szCs w:val="22"/>
-              </w:rPr>
-              <w:t xml:space="preserve">Kun je het CS arceren in een grafiek en de oppervlakte berekenen?</w:t>
-            </w:r>
-          </w:p>
-        </w:tc>
-      </w:tr>
-    </w:tbl>
-    <w:p>
-      <w:pPr>
-        <w:spacing w:after="60"/>
+        <w:spacing w:after="40"/>
       </w:pPr>
     </w:p>
     <w:tbl>
@@ -1703,12 +1600,12 @@
             <w:tcW w:type="dxa" w:w="9026"/>
             <w:gridSpan w:val="2"/>
             <w:tcBorders>
-              <w:top w:val="single" w:color="1E8449" w:sz="1"/>
-              <w:left w:val="single" w:color="1E8449" w:sz="1"/>
-              <w:bottom w:val="single" w:color="1E8449" w:sz="1"/>
-              <w:right w:val="single" w:color="1E8449" w:sz="1"/>
-            </w:tcBorders>
-            <w:shd w:fill="1E8449" w:val="clear"/>
+              <w:top w:val="single" w:color="1A5276" w:sz="1"/>
+              <w:left w:val="single" w:color="1A5276" w:sz="1"/>
+              <w:bottom w:val="single" w:color="1A5276" w:sz="1"/>
+              <w:right w:val="single" w:color="1A5276" w:sz="1"/>
+            </w:tcBorders>
+            <w:shd w:fill="1A5276" w:val="clear"/>
             <w:tcMar>
               <w:top w:type="dxa" w:w="80"/>
               <w:left w:type="dxa" w:w="140"/>
@@ -1755,11 +1652,11 @@
                 <w:rFonts w:ascii="Arial" w:cs="Arial" w:eastAsia="Arial" w:hAnsi="Arial"/>
                 <w:b/>
                 <w:bCs/>
-                <w:color w:val="1E8449"/>
+                <w:color w:val="1A5276"/>
                 <w:sz w:val="20"/>
                 <w:szCs w:val="20"/>
               </w:rPr>
-              <w:t xml:space="preserve">CS</w:t>
+              <w:t xml:space="preserve">Formule</w:t>
             </w:r>
           </w:p>
         </w:tc>
@@ -1788,7 +1685,7 @@
                 <w:sz w:val="20"/>
                 <w:szCs w:val="20"/>
               </w:rPr>
-              <w:t xml:space="preserve">Driehoek boven P* en onder vraaglijn V</w:t>
+              <w:t xml:space="preserve">CS = ½ × Q* × (P_max − P*)</w:t>
             </w:r>
           </w:p>
         </w:tc>
@@ -1817,11 +1714,11 @@
                 <w:rFonts w:ascii="Arial" w:cs="Arial" w:eastAsia="Arial" w:hAnsi="Arial"/>
                 <w:b/>
                 <w:bCs/>
-                <w:color w:val="1E8449"/>
+                <w:color w:val="1A5276"/>
                 <w:sz w:val="20"/>
                 <w:szCs w:val="20"/>
               </w:rPr>
-              <w:t xml:space="preserve">Formule</w:t>
+              <w:t xml:space="preserve">Grafisch</w:t>
             </w:r>
           </w:p>
         </w:tc>
@@ -1850,7 +1747,7 @@
                 <w:sz w:val="20"/>
                 <w:szCs w:val="20"/>
               </w:rPr>
-              <w:t xml:space="preserve">½ × Q* × (P_max − P*)</w:t>
+              <w:t xml:space="preserve">Driehoek boven P*, onder V</w:t>
             </w:r>
           </w:p>
         </w:tc>
@@ -1879,11 +1776,11 @@
                 <w:rFonts w:ascii="Arial" w:cs="Arial" w:eastAsia="Arial" w:hAnsi="Arial"/>
                 <w:b/>
                 <w:bCs/>
-                <w:color w:val="1E8449"/>
+                <w:color w:val="1A5276"/>
                 <w:sz w:val="20"/>
                 <w:szCs w:val="20"/>
               </w:rPr>
-              <w:t xml:space="preserve">Verband</w:t>
+              <w:t xml:space="preserve">Bij VC</w:t>
             </w:r>
           </w:p>
         </w:tc>
@@ -1912,7 +1809,7 @@
                 <w:sz w:val="20"/>
                 <w:szCs w:val="20"/>
               </w:rPr>
-              <w:t xml:space="preserve">Hoe lager de prijs, hoe groter het CS</w:t>
+              <w:t xml:space="preserve">CS = 450</w:t>
             </w:r>
           </w:p>
         </w:tc>
@@ -1944,12 +1841,12 @@
           <w:tcPr>
             <w:tcW w:type="dxa" w:w="600"/>
             <w:tcBorders>
-              <w:top w:val="single" w:color="1E8449" w:sz="1"/>
-              <w:left w:val="single" w:color="1E8449" w:sz="1"/>
-              <w:bottom w:val="single" w:color="1E8449" w:sz="1"/>
-              <w:right w:val="none" w:color="1E8449" w:sz="0"/>
-            </w:tcBorders>
-            <w:shd w:fill="1E8449" w:val="clear"/>
+              <w:top w:val="single" w:color="1A5276" w:sz="1"/>
+              <w:left w:val="single" w:color="1A5276" w:sz="1"/>
+              <w:bottom w:val="single" w:color="1A5276" w:sz="1"/>
+              <w:right w:val="none" w:color="1A5276" w:sz="0"/>
+            </w:tcBorders>
+            <w:shd w:fill="1A5276" w:val="clear"/>
             <w:tcMar>
               <w:top w:type="dxa" w:w="140"/>
               <w:left w:type="dxa" w:w="120"/>
@@ -1979,12 +1876,12 @@
           <w:tcPr>
             <w:tcW w:type="dxa" w:w="8426"/>
             <w:tcBorders>
-              <w:top w:val="single" w:color="1E8449" w:sz="1"/>
-              <w:left w:val="none" w:color="1E8449" w:sz="0"/>
-              <w:bottom w:val="single" w:color="1E8449" w:sz="1"/>
-              <w:right w:val="single" w:color="1E8449" w:sz="1"/>
-            </w:tcBorders>
-            <w:shd w:fill="E8F8F0" w:val="clear"/>
+              <w:top w:val="single" w:color="1A5276" w:sz="1"/>
+              <w:left w:val="none" w:color="1A5276" w:sz="0"/>
+              <w:bottom w:val="single" w:color="1A5276" w:sz="1"/>
+              <w:right w:val="single" w:color="1A5276" w:sz="1"/>
+            </w:tcBorders>
+            <w:shd w:fill="EBF5FB" w:val="clear"/>
             <w:tcMar>
               <w:top w:type="dxa" w:w="140"/>
               <w:left w:type="dxa" w:w="200"/>
@@ -1999,7 +1896,7 @@
                 <w:rFonts w:ascii="Arial" w:cs="Arial" w:eastAsia="Arial" w:hAnsi="Arial"/>
                 <w:b/>
                 <w:bCs/>
-                <w:color w:val="186A3B"/>
+                <w:color w:val="154360"/>
                 <w:sz w:val="28"/>
                 <w:szCs w:val="28"/>
               </w:rPr>
@@ -2015,11 +1912,11 @@
                 <w:rFonts w:ascii="Arial" w:cs="Arial" w:eastAsia="Arial" w:hAnsi="Arial"/>
                 <w:i/>
                 <w:iCs/>
-                <w:color w:val="1E8449"/>
+                <w:color w:val="1A5276"/>
                 <w:sz w:val="18"/>
                 <w:szCs w:val="18"/>
               </w:rPr>
-              <w:t xml:space="preserve">Grafisch</w:t>
+              <w:t xml:space="preserve">Marktanalyse</w:t>
             </w:r>
           </w:p>
         </w:tc>
@@ -2040,7 +1937,7 @@
           <w:rFonts w:ascii="Arial" w:cs="Arial" w:eastAsia="Arial" w:hAnsi="Arial"/>
           <w:b/>
           <w:bCs/>
-          <w:color w:val="1E8449"/>
+          <w:color w:val="1A5276"/>
           <w:sz w:val="24"/>
           <w:szCs w:val="24"/>
         </w:rPr>
@@ -2090,7 +1987,7 @@
           <w:rFonts w:ascii="Arial" w:cs="Arial" w:eastAsia="Arial" w:hAnsi="Arial"/>
           <w:b/>
           <w:bCs/>
-          <w:color w:val="1E8449"/>
+          <w:color w:val="1A5276"/>
           <w:sz w:val="24"/>
           <w:szCs w:val="24"/>
         </w:rPr>
@@ -2118,7 +2015,7 @@
             <w:tcW w:type="dxa" w:w="9026"/>
             <w:tcBorders>
               <w:top w:val="single" w:color="CBD5E0" w:sz="1"/>
-              <w:left w:val="single" w:color="1E8449" w:sz="8"/>
+              <w:left w:val="single" w:color="1A5276" w:sz="8"/>
               <w:bottom w:val="single" w:color="CBD5E0" w:sz="1"/>
               <w:right w:val="single" w:color="CBD5E0" w:sz="1"/>
             </w:tcBorders>
@@ -2141,7 +2038,7 @@
                 <w:sz w:val="22"/>
                 <w:szCs w:val="22"/>
               </w:rPr>
-              <w:t xml:space="preserve">Stap 1: Zoek de evenwichtsprijs P* en hoeveelheid Q*</w:t>
+              <w:t xml:space="preserve">Stap 1: Zoek de evenwichtsprijs (P*) en -hoeveelheid (Q*)</w:t>
             </w:r>
           </w:p>
           <w:p>
@@ -2155,7 +2052,7 @@
                 <w:sz w:val="22"/>
                 <w:szCs w:val="22"/>
               </w:rPr>
-              <w:t xml:space="preserve">Stap 2: PS = gebied tussen P*-lijn en MK-lijn (van Q=0 tot Q*)</w:t>
+              <w:t xml:space="preserve">Stap 2: Zoek het snijpunt van de aanbodlijn (MK) met de P-as</w:t>
             </w:r>
           </w:p>
           <w:p>
@@ -2169,7 +2066,21 @@
                 <w:sz w:val="22"/>
                 <w:szCs w:val="22"/>
               </w:rPr>
-              <w:t xml:space="preserve">Stap 3: Bij lineaire MK door oorsprong: PS = ½ × Q* × P*</w:t>
+              <w:t xml:space="preserve">Stap 3: Arceer de driehoek: onder P*, boven MK, van Q = 0 tot Q*</w:t>
+            </w:r>
+          </w:p>
+          <w:p>
+            <w:pPr>
+              <w:spacing w:after="60"/>
+            </w:pPr>
+            <w:r>
+              <w:rPr>
+                <w:rFonts w:ascii="Consolas" w:cs="Consolas" w:eastAsia="Consolas" w:hAnsi="Consolas"/>
+                <w:color w:val="2D3748"/>
+                <w:sz w:val="22"/>
+                <w:szCs w:val="22"/>
+              </w:rPr>
+              <w:t xml:space="preserve">Stap 4: Bereken: PS = ½ × Q* × (P* − MK_min)</w:t>
             </w:r>
           </w:p>
         </w:tc>
@@ -2190,7 +2101,7 @@
           <w:rFonts w:ascii="Arial" w:cs="Arial" w:eastAsia="Arial" w:hAnsi="Arial"/>
           <w:b/>
           <w:bCs/>
-          <w:color w:val="1E8449"/>
+          <w:color w:val="1A5276"/>
           <w:sz w:val="24"/>
           <w:szCs w:val="24"/>
         </w:rPr>
@@ -2210,11 +2121,6 @@
         </w:rPr>
         <w:t xml:space="preserve">Bij volkomen concurrentie: MK = Q, Q* = 30, P* = 30.</w:t>
       </w:r>
-    </w:p>
-    <w:p>
-      <w:pPr>
-        <w:spacing w:after="40"/>
-      </w:pPr>
     </w:p>
     <w:tbl>
       <w:tblPr>
@@ -2237,7 +2143,7 @@
             <w:tcW w:type="dxa" w:w="9026"/>
             <w:tcBorders>
               <w:top w:val="single" w:color="CBD5E0" w:sz="1"/>
-              <w:left w:val="single" w:color="1E8449" w:sz="8"/>
+              <w:left w:val="single" w:color="1A5276" w:sz="8"/>
               <w:bottom w:val="single" w:color="CBD5E0" w:sz="1"/>
               <w:right w:val="single" w:color="CBD5E0" w:sz="1"/>
             </w:tcBorders>
@@ -2260,6 +2166,34 @@
                 <w:sz w:val="22"/>
                 <w:szCs w:val="22"/>
               </w:rPr>
+              <w:t xml:space="preserve">MK_min = 0 (snijpunt MK met P-as, bij Q = 0)</w:t>
+            </w:r>
+          </w:p>
+          <w:p>
+            <w:pPr>
+              <w:spacing w:after="60"/>
+            </w:pPr>
+            <w:r>
+              <w:rPr>
+                <w:rFonts w:ascii="Consolas" w:cs="Consolas" w:eastAsia="Consolas" w:hAnsi="Consolas"/>
+                <w:color w:val="2D3748"/>
+                <w:sz w:val="22"/>
+                <w:szCs w:val="22"/>
+              </w:rPr>
+              <w:t xml:space="preserve">PS = ½ × 30 × (30 − 0)</w:t>
+            </w:r>
+          </w:p>
+          <w:p>
+            <w:pPr>
+              <w:spacing w:after="60"/>
+            </w:pPr>
+            <w:r>
+              <w:rPr>
+                <w:rFonts w:ascii="Consolas" w:cs="Consolas" w:eastAsia="Consolas" w:hAnsi="Consolas"/>
+                <w:color w:val="2D3748"/>
+                <w:sz w:val="22"/>
+                <w:szCs w:val="22"/>
+              </w:rPr>
               <w:t xml:space="preserve">PS = ½ × 30 × 30 = 450</w:t>
             </w:r>
           </w:p>
@@ -2268,7 +2202,7 @@
     </w:tbl>
     <w:p>
       <w:pPr>
-        <w:spacing w:after="60"/>
+        <w:spacing w:after="40"/>
       </w:pPr>
     </w:p>
     <w:tbl>
@@ -2291,12 +2225,12 @@
           <w:tcPr>
             <w:tcW w:type="dxa" w:w="9026"/>
             <w:tcBorders>
-              <w:top w:val="single" w:color="FEF5E7" w:sz="1"/>
-              <w:left w:val="single" w:color="E67E22" w:sz="12"/>
-              <w:bottom w:val="single" w:color="FEF5E7" w:sz="1"/>
-              <w:right w:val="single" w:color="FEF5E7" w:sz="1"/>
-            </w:tcBorders>
-            <w:shd w:fill="FEF5E7" w:val="clear"/>
+              <w:top w:val="single" w:color="EBF5FB" w:sz="1"/>
+              <w:left w:val="single" w:color="1A5276" w:sz="12"/>
+              <w:bottom w:val="single" w:color="EBF5FB" w:sz="1"/>
+              <w:right w:val="single" w:color="EBF5FB" w:sz="1"/>
+            </w:tcBorders>
+            <w:shd w:fill="EBF5FB" w:val="clear"/>
             <w:tcMar>
               <w:top w:type="dxa" w:w="120"/>
               <w:left w:type="dxa" w:w="200"/>
@@ -2310,20 +2244,20 @@
                 <w:rFonts w:ascii="Arial" w:cs="Arial" w:eastAsia="Arial" w:hAnsi="Arial"/>
                 <w:b/>
                 <w:bCs/>
-                <w:color w:val="E67E22"/>
-                <w:sz w:val="22"/>
-                <w:szCs w:val="22"/>
-              </w:rPr>
-              <w:t xml:space="preserve">⭐ Kernregel: </w:t>
-            </w:r>
-            <w:r>
-              <w:rPr>
-                <w:rFonts w:ascii="Arial" w:cs="Arial" w:eastAsia="Arial" w:hAnsi="Arial"/>
-                <w:color w:val="2D3748"/>
-                <w:sz w:val="22"/>
-                <w:szCs w:val="22"/>
-              </w:rPr>
-              <w:t xml:space="preserve">Bij volkomen concurrentie is PS = driehoek ónder de prijs en boven de MK-lijn. Bij monopolie verandert de vorm.</w:t>
+                <w:color w:val="1A5276"/>
+                <w:sz w:val="22"/>
+                <w:szCs w:val="22"/>
+              </w:rPr>
+              <w:t xml:space="preserve">✨ Tip: </w:t>
+            </w:r>
+            <w:r>
+              <w:rPr>
+                <w:rFonts w:ascii="Arial" w:cs="Arial" w:eastAsia="Arial" w:hAnsi="Arial"/>
+                <w:color w:val="2D3748"/>
+                <w:sz w:val="22"/>
+                <w:szCs w:val="22"/>
+              </w:rPr>
+              <w:t xml:space="preserve">Bij een lineaire MK-lijn door de oorsprong is PS = ½ × Q* × P*.</w:t>
             </w:r>
           </w:p>
         </w:tc>
@@ -2331,133 +2265,7 @@
     </w:tbl>
     <w:p>
       <w:pPr>
-        <w:spacing w:after="60"/>
-      </w:pPr>
-    </w:p>
-    <w:tbl>
-      <w:tblPr>
-        <w:tblW w:type="dxa" w:w="9026"/>
-        <w:tblBorders>
-          <w:top w:val="single" w:color="auto" w:sz="4"/>
-          <w:left w:val="single" w:color="auto" w:sz="4"/>
-          <w:bottom w:val="single" w:color="auto" w:sz="4"/>
-          <w:right w:val="single" w:color="auto" w:sz="4"/>
-          <w:insideH w:val="single" w:color="auto" w:sz="4"/>
-          <w:insideV w:val="single" w:color="auto" w:sz="4"/>
-        </w:tblBorders>
-      </w:tblPr>
-      <w:tblGrid>
-        <w:gridCol w:w="9026"/>
-      </w:tblGrid>
-      <w:tr>
-        <w:tc>
-          <w:tcPr>
-            <w:tcW w:type="dxa" w:w="9026"/>
-            <w:tcBorders>
-              <w:top w:val="single" w:color="FDE8E8" w:sz="1"/>
-              <w:left w:val="single" w:color="D9534F" w:sz="12"/>
-              <w:bottom w:val="single" w:color="FDE8E8" w:sz="1"/>
-              <w:right w:val="single" w:color="FDE8E8" w:sz="1"/>
-            </w:tcBorders>
-            <w:shd w:fill="FDE8E8" w:val="clear"/>
-            <w:tcMar>
-              <w:top w:type="dxa" w:w="120"/>
-              <w:left w:type="dxa" w:w="200"/>
-              <w:bottom w:type="dxa" w:w="120"/>
-              <w:right w:type="dxa" w:w="200"/>
-            </w:tcMar>
-          </w:tcPr>
-          <w:p>
-            <w:r>
-              <w:rPr>
-                <w:rFonts w:ascii="Arial" w:cs="Arial" w:eastAsia="Arial" w:hAnsi="Arial"/>
-                <w:b/>
-                <w:bCs/>
-                <w:color w:val="D9534F"/>
-                <w:sz w:val="22"/>
-                <w:szCs w:val="22"/>
-              </w:rPr>
-              <w:t xml:space="preserve">⚠ Let op: </w:t>
-            </w:r>
-            <w:r>
-              <w:rPr>
-                <w:rFonts w:ascii="Arial" w:cs="Arial" w:eastAsia="Arial" w:hAnsi="Arial"/>
-                <w:color w:val="2D3748"/>
-                <w:sz w:val="22"/>
-                <w:szCs w:val="22"/>
-              </w:rPr>
-              <w:t xml:space="preserve">Bij monopolie is het PS een trapezium, niet een driehoek! De prijs ligt hoger dan bij VC, waardoor de vorm verandert.</w:t>
-            </w:r>
-          </w:p>
-        </w:tc>
-      </w:tr>
-    </w:tbl>
-    <w:p>
-      <w:pPr>
-        <w:spacing w:after="60"/>
-      </w:pPr>
-    </w:p>
-    <w:tbl>
-      <w:tblPr>
-        <w:tblW w:type="dxa" w:w="9026"/>
-        <w:tblBorders>
-          <w:top w:val="single" w:color="auto" w:sz="4"/>
-          <w:left w:val="single" w:color="auto" w:sz="4"/>
-          <w:bottom w:val="single" w:color="auto" w:sz="4"/>
-          <w:right w:val="single" w:color="auto" w:sz="4"/>
-          <w:insideH w:val="single" w:color="auto" w:sz="4"/>
-          <w:insideV w:val="single" w:color="auto" w:sz="4"/>
-        </w:tblBorders>
-      </w:tblPr>
-      <w:tblGrid>
-        <w:gridCol w:w="9026"/>
-      </w:tblGrid>
-      <w:tr>
-        <w:tc>
-          <w:tcPr>
-            <w:tcW w:type="dxa" w:w="9026"/>
-            <w:tcBorders>
-              <w:top w:val="single" w:color="E8F5E9" w:sz="1"/>
-              <w:left w:val="single" w:color="1E8449" w:sz="12"/>
-              <w:bottom w:val="single" w:color="E8F5E9" w:sz="1"/>
-              <w:right w:val="single" w:color="E8F5E9" w:sz="1"/>
-            </w:tcBorders>
-            <w:shd w:fill="E8F5E9" w:val="clear"/>
-            <w:tcMar>
-              <w:top w:type="dxa" w:w="120"/>
-              <w:left w:type="dxa" w:w="200"/>
-              <w:bottom w:type="dxa" w:w="120"/>
-              <w:right w:type="dxa" w:w="200"/>
-            </w:tcMar>
-          </w:tcPr>
-          <w:p>
-            <w:r>
-              <w:rPr>
-                <w:rFonts w:ascii="Arial" w:cs="Arial" w:eastAsia="Arial" w:hAnsi="Arial"/>
-                <w:b/>
-                <w:bCs/>
-                <w:color w:val="1E8449"/>
-                <w:sz w:val="22"/>
-                <w:szCs w:val="22"/>
-              </w:rPr>
-              <w:t xml:space="preserve">✅ Controle: </w:t>
-            </w:r>
-            <w:r>
-              <w:rPr>
-                <w:rFonts w:ascii="Arial" w:cs="Arial" w:eastAsia="Arial" w:hAnsi="Arial"/>
-                <w:color w:val="2D3748"/>
-                <w:sz w:val="22"/>
-                <w:szCs w:val="22"/>
-              </w:rPr>
-              <w:t xml:space="preserve">Kun je het PS arceren in een grafiek bij zowel VC als monopolie?</w:t>
-            </w:r>
-          </w:p>
-        </w:tc>
-      </w:tr>
-    </w:tbl>
-    <w:p>
-      <w:pPr>
-        <w:spacing w:after="60"/>
+        <w:spacing w:after="40"/>
       </w:pPr>
     </w:p>
     <w:tbl>
@@ -2482,12 +2290,12 @@
             <w:tcW w:type="dxa" w:w="9026"/>
             <w:gridSpan w:val="2"/>
             <w:tcBorders>
-              <w:top w:val="single" w:color="1E8449" w:sz="1"/>
-              <w:left w:val="single" w:color="1E8449" w:sz="1"/>
-              <w:bottom w:val="single" w:color="1E8449" w:sz="1"/>
-              <w:right w:val="single" w:color="1E8449" w:sz="1"/>
-            </w:tcBorders>
-            <w:shd w:fill="1E8449" w:val="clear"/>
+              <w:top w:val="single" w:color="1A5276" w:sz="1"/>
+              <w:left w:val="single" w:color="1A5276" w:sz="1"/>
+              <w:bottom w:val="single" w:color="1A5276" w:sz="1"/>
+              <w:right w:val="single" w:color="1A5276" w:sz="1"/>
+            </w:tcBorders>
+            <w:shd w:fill="1A5276" w:val="clear"/>
             <w:tcMar>
               <w:top w:type="dxa" w:w="80"/>
               <w:left w:type="dxa" w:w="140"/>
@@ -2534,11 +2342,11 @@
                 <w:rFonts w:ascii="Arial" w:cs="Arial" w:eastAsia="Arial" w:hAnsi="Arial"/>
                 <w:b/>
                 <w:bCs/>
-                <w:color w:val="1E8449"/>
+                <w:color w:val="1A5276"/>
                 <w:sz w:val="20"/>
                 <w:szCs w:val="20"/>
               </w:rPr>
-              <w:t xml:space="preserve">PS</w:t>
+              <w:t xml:space="preserve">Formule</w:t>
             </w:r>
           </w:p>
         </w:tc>
@@ -2567,7 +2375,7 @@
                 <w:sz w:val="20"/>
                 <w:szCs w:val="20"/>
               </w:rPr>
-              <w:t xml:space="preserve">Gebied onder P* en boven MK-lijn</w:t>
+              <w:t xml:space="preserve">PS = ½ × Q* × (P* − MK_min)</w:t>
             </w:r>
           </w:p>
         </w:tc>
@@ -2596,11 +2404,11 @@
                 <w:rFonts w:ascii="Arial" w:cs="Arial" w:eastAsia="Arial" w:hAnsi="Arial"/>
                 <w:b/>
                 <w:bCs/>
-                <w:color w:val="1E8449"/>
+                <w:color w:val="1A5276"/>
                 <w:sz w:val="20"/>
                 <w:szCs w:val="20"/>
               </w:rPr>
-              <w:t xml:space="preserve">VC</w:t>
+              <w:t xml:space="preserve">Grafisch</w:t>
             </w:r>
           </w:p>
         </w:tc>
@@ -2629,7 +2437,7 @@
                 <w:sz w:val="20"/>
                 <w:szCs w:val="20"/>
               </w:rPr>
-              <w:t xml:space="preserve">PS = driehoek ½ × Q* × P*</w:t>
+              <w:t xml:space="preserve">Driehoek onder P*, boven MK</w:t>
             </w:r>
           </w:p>
         </w:tc>
@@ -2658,11 +2466,11 @@
                 <w:rFonts w:ascii="Arial" w:cs="Arial" w:eastAsia="Arial" w:hAnsi="Arial"/>
                 <w:b/>
                 <w:bCs/>
-                <w:color w:val="1E8449"/>
+                <w:color w:val="1A5276"/>
                 <w:sz w:val="20"/>
                 <w:szCs w:val="20"/>
               </w:rPr>
-              <w:t xml:space="preserve">Monopolie</w:t>
+              <w:t xml:space="preserve">Bij VC</w:t>
             </w:r>
           </w:p>
         </w:tc>
@@ -2691,7 +2499,7 @@
                 <w:sz w:val="20"/>
                 <w:szCs w:val="20"/>
               </w:rPr>
-              <w:t xml:space="preserve">PS wordt een trapezium</w:t>
+              <w:t xml:space="preserve">PS = 450</w:t>
             </w:r>
           </w:p>
         </w:tc>
@@ -2782,7 +2590,7 @@
                 <w:sz w:val="28"/>
                 <w:szCs w:val="28"/>
               </w:rPr>
-              <w:t xml:space="preserve">Harbergerdriehoek herkennen</w:t>
+              <w:t xml:space="preserve">Harbergerdriehoek berekenen</w:t>
             </w:r>
           </w:p>
           <w:p>
@@ -2847,11 +2655,35 @@
       <w:r>
         <w:rPr>
           <w:rFonts w:ascii="Arial" w:cs="Arial" w:eastAsia="Arial" w:hAnsi="Arial"/>
+          <w:b/>
+          <w:bCs/>
           <w:color w:val="2D3748"/>
           <w:sz w:val="22"/>
           <w:szCs w:val="22"/>
         </w:rPr>
-        <w:t xml:space="preserve">Dit surplus verdwijnt volledig — niemand krijgt het meer.</w:t>
+        <w:t xml:space="preserve">Dit surplus verdwijnt volledig — het gaat niet naar de producent en niet naar de consument, het is simpelweg </w:t>
+      </w:r>
+      <w:r>
+        <w:rPr>
+          <w:rFonts w:ascii="Arial" w:cs="Arial" w:eastAsia="Arial" w:hAnsi="Arial"/>
+          <w:b/>
+          <w:bCs/>
+          <w:color w:val="D9534F"/>
+          <w:sz w:val="22"/>
+          <w:szCs w:val="22"/>
+        </w:rPr>
+        <w:t xml:space="preserve">weg</w:t>
+      </w:r>
+      <w:r>
+        <w:rPr>
+          <w:rFonts w:ascii="Arial" w:cs="Arial" w:eastAsia="Arial" w:hAnsi="Arial"/>
+          <w:b/>
+          <w:bCs/>
+          <w:color w:val="2D3748"/>
+          <w:sz w:val="22"/>
+          <w:szCs w:val="22"/>
+        </w:rPr>
+        <w:t xml:space="preserve">. Transacties die voor koper én verkoper voordelig waren, vinden niet plaats.</w:t>
       </w:r>
     </w:p>
     <w:p>
@@ -2920,7 +2752,7 @@
                 <w:sz w:val="22"/>
                 <w:szCs w:val="22"/>
               </w:rPr>
-              <w:t xml:space="preserve">Stap 1: Teken het evenwicht bij VC (punt B)</w:t>
+              <w:t xml:space="preserve">Stap 1: Bereken het VC-evenwicht: V = MK → Q_vc, P_vc</w:t>
             </w:r>
           </w:p>
           <w:p>
@@ -2934,7 +2766,7 @@
                 <w:sz w:val="22"/>
                 <w:szCs w:val="22"/>
               </w:rPr>
-              <w:t xml:space="preserve">Stap 2: Teken het monopolie-evenwicht: MO = MK (punt A), prijs op V (punt C)</w:t>
+              <w:t xml:space="preserve">Stap 2: Bereken de monopolie-uitkomst: MO = MK → Q_m</w:t>
             </w:r>
           </w:p>
           <w:p>
@@ -2948,7 +2780,7 @@
                 <w:sz w:val="22"/>
                 <w:szCs w:val="22"/>
               </w:rPr>
-              <w:t xml:space="preserve">Stap 3: De Harbergerdriehoek = driehoek C-B-A</w:t>
+              <w:t xml:space="preserve">Stap 3: Bepaal P_m op de vraaglijn bij Q_m</w:t>
             </w:r>
           </w:p>
           <w:p>
@@ -2962,7 +2794,21 @@
                 <w:sz w:val="22"/>
                 <w:szCs w:val="22"/>
               </w:rPr>
-              <w:t xml:space="preserve">Stap 4: Oppervlakte = ½ × (Q_vc − Q_m) × (P_m − MK_m)</w:t>
+              <w:t xml:space="preserve">Stap 4: Bepaal MK_m bij Q_m</w:t>
+            </w:r>
+          </w:p>
+          <w:p>
+            <w:pPr>
+              <w:spacing w:after="60"/>
+            </w:pPr>
+            <w:r>
+              <w:rPr>
+                <w:rFonts w:ascii="Consolas" w:cs="Consolas" w:eastAsia="Consolas" w:hAnsi="Consolas"/>
+                <w:color w:val="2D3748"/>
+                <w:sz w:val="22"/>
+                <w:szCs w:val="22"/>
+              </w:rPr>
+              <w:t xml:space="preserve">Stap 5: Harbergerdriehoek = ½ × (Q_vc − Q_m) × (P_m − MK_m)</w:t>
             </w:r>
           </w:p>
         </w:tc>
@@ -3003,11 +2849,6 @@
         </w:rPr>
         <w:t xml:space="preserve">VC: Q_vc = 30, P_vc = 30. Monopolie: Q_m = 20, P_m = 40, MK_m = 20.</w:t>
       </w:r>
-    </w:p>
-    <w:p>
-      <w:pPr>
-        <w:spacing w:after="40"/>
-      </w:pPr>
     </w:p>
     <w:tbl>
       <w:tblPr>
@@ -3053,6 +2894,90 @@
                 <w:sz w:val="22"/>
                 <w:szCs w:val="22"/>
               </w:rPr>
+              <w:t xml:space="preserve">V: P = 60 − Q,  MK: P = Q,  MO: P = 60 − 2Q</w:t>
+            </w:r>
+          </w:p>
+          <w:p>
+            <w:pPr>
+              <w:spacing w:after="60"/>
+            </w:pPr>
+            <w:r>
+              <w:rPr>
+                <w:rFonts w:ascii="Consolas" w:cs="Consolas" w:eastAsia="Consolas" w:hAnsi="Consolas"/>
+                <w:color w:val="2D3748"/>
+                <w:sz w:val="22"/>
+                <w:szCs w:val="22"/>
+              </w:rPr>
+              <w:t xml:space="preserve"/>
+            </w:r>
+          </w:p>
+          <w:p>
+            <w:pPr>
+              <w:spacing w:after="60"/>
+            </w:pPr>
+            <w:r>
+              <w:rPr>
+                <w:rFonts w:ascii="Consolas" w:cs="Consolas" w:eastAsia="Consolas" w:hAnsi="Consolas"/>
+                <w:color w:val="2D3748"/>
+                <w:sz w:val="22"/>
+                <w:szCs w:val="22"/>
+              </w:rPr>
+              <w:t xml:space="preserve">MO = MK:  60 − 2Q = Q  →  Q_m = 20</w:t>
+            </w:r>
+          </w:p>
+          <w:p>
+            <w:pPr>
+              <w:spacing w:after="60"/>
+            </w:pPr>
+            <w:r>
+              <w:rPr>
+                <w:rFonts w:ascii="Consolas" w:cs="Consolas" w:eastAsia="Consolas" w:hAnsi="Consolas"/>
+                <w:color w:val="2D3748"/>
+                <w:sz w:val="22"/>
+                <w:szCs w:val="22"/>
+              </w:rPr>
+              <w:t xml:space="preserve">P_m = 60 − 20 = 40  (afgelezen op V)</w:t>
+            </w:r>
+          </w:p>
+          <w:p>
+            <w:pPr>
+              <w:spacing w:after="60"/>
+            </w:pPr>
+            <w:r>
+              <w:rPr>
+                <w:rFonts w:ascii="Consolas" w:cs="Consolas" w:eastAsia="Consolas" w:hAnsi="Consolas"/>
+                <w:color w:val="2D3748"/>
+                <w:sz w:val="22"/>
+                <w:szCs w:val="22"/>
+              </w:rPr>
+              <w:t xml:space="preserve">MK_m = 20  (ingevuld in MK = Q)</w:t>
+            </w:r>
+          </w:p>
+          <w:p>
+            <w:pPr>
+              <w:spacing w:after="60"/>
+            </w:pPr>
+            <w:r>
+              <w:rPr>
+                <w:rFonts w:ascii="Consolas" w:cs="Consolas" w:eastAsia="Consolas" w:hAnsi="Consolas"/>
+                <w:color w:val="2D3748"/>
+                <w:sz w:val="22"/>
+                <w:szCs w:val="22"/>
+              </w:rPr>
+              <w:t xml:space="preserve"/>
+            </w:r>
+          </w:p>
+          <w:p>
+            <w:pPr>
+              <w:spacing w:after="60"/>
+            </w:pPr>
+            <w:r>
+              <w:rPr>
+                <w:rFonts w:ascii="Consolas" w:cs="Consolas" w:eastAsia="Consolas" w:hAnsi="Consolas"/>
+                <w:color w:val="2D3748"/>
+                <w:sz w:val="22"/>
+                <w:szCs w:val="22"/>
+              </w:rPr>
               <w:t xml:space="preserve">Harbergerdriehoek = ½ × (30 − 20) × (40 − 20)</w:t>
             </w:r>
           </w:p>
@@ -3067,7 +2992,7 @@
                 <w:sz w:val="22"/>
                 <w:szCs w:val="22"/>
               </w:rPr>
-              <w:t xml:space="preserve">                  = ½ × 10 × 20 = 100</w:t>
+              <w:t xml:space="preserve">                   = ½ × 10 × 20 = 100</w:t>
             </w:r>
           </w:p>
         </w:tc>
@@ -3075,7 +3000,149 @@
     </w:tbl>
     <w:p>
       <w:pPr>
-        <w:spacing w:after="60"/>
+        <w:spacing w:after="40"/>
+      </w:pPr>
+    </w:p>
+    <w:p>
+      <w:pPr>
+        <w:pStyle w:val="Heading2"/>
+        <w:spacing w:after="120" w:before="200"/>
+      </w:pPr>
+      <w:r>
+        <w:rPr>
+          <w:rFonts w:ascii="Arial" w:cs="Arial" w:eastAsia="Arial" w:hAnsi="Arial"/>
+          <w:b/>
+          <w:bCs/>
+          <w:color w:val="1A5276"/>
+          <w:sz w:val="24"/>
+          <w:szCs w:val="24"/>
+        </w:rPr>
+        <w:t xml:space="preserve">Wat zie je in de grafiek?</w:t>
+      </w:r>
+    </w:p>
+    <w:p>
+      <w:pPr>
+        <w:pStyle w:val="ListParagraph"/>
+        <w:numPr>
+          <w:ilvl w:val="0"/>
+          <w:numId w:val="1"/>
+        </w:numPr>
+        <w:spacing w:after="80"/>
+      </w:pPr>
+      <w:r>
+        <w:rPr>
+          <w:rFonts w:ascii="Arial" w:cs="Arial" w:eastAsia="Arial" w:hAnsi="Arial"/>
+          <w:b/>
+          <w:bCs/>
+          <w:color w:val="2D3748"/>
+          <w:sz w:val="22"/>
+          <w:szCs w:val="22"/>
+        </w:rPr>
+        <w:t xml:space="preserve">Punt B (30, 30)</w:t>
+      </w:r>
+      <w:r>
+        <w:rPr>
+          <w:rFonts w:ascii="Arial" w:cs="Arial" w:eastAsia="Arial" w:hAnsi="Arial"/>
+          <w:color w:val="2D3748"/>
+          <w:sz w:val="22"/>
+          <w:szCs w:val="22"/>
+        </w:rPr>
+        <w:t xml:space="preserve"> — het evenwicht bij volkomen concurrentie, waar V = MK.</w:t>
+      </w:r>
+    </w:p>
+    <w:p>
+      <w:pPr>
+        <w:pStyle w:val="ListParagraph"/>
+        <w:numPr>
+          <w:ilvl w:val="0"/>
+          <w:numId w:val="1"/>
+        </w:numPr>
+        <w:spacing w:after="80"/>
+      </w:pPr>
+      <w:r>
+        <w:rPr>
+          <w:rFonts w:ascii="Arial" w:cs="Arial" w:eastAsia="Arial" w:hAnsi="Arial"/>
+          <w:b/>
+          <w:bCs/>
+          <w:color w:val="2D3748"/>
+          <w:sz w:val="22"/>
+          <w:szCs w:val="22"/>
+        </w:rPr>
+        <w:t xml:space="preserve">Punt A (20, 20)</w:t>
+      </w:r>
+      <w:r>
+        <w:rPr>
+          <w:rFonts w:ascii="Arial" w:cs="Arial" w:eastAsia="Arial" w:hAnsi="Arial"/>
+          <w:color w:val="2D3748"/>
+          <w:sz w:val="22"/>
+          <w:szCs w:val="22"/>
+        </w:rPr>
+        <w:t xml:space="preserve"> — waar MO = MK; hier bepaalt de monopolist zijn hoeveelheid.</w:t>
+      </w:r>
+    </w:p>
+    <w:p>
+      <w:pPr>
+        <w:pStyle w:val="ListParagraph"/>
+        <w:numPr>
+          <w:ilvl w:val="0"/>
+          <w:numId w:val="1"/>
+        </w:numPr>
+        <w:spacing w:after="80"/>
+      </w:pPr>
+      <w:r>
+        <w:rPr>
+          <w:rFonts w:ascii="Arial" w:cs="Arial" w:eastAsia="Arial" w:hAnsi="Arial"/>
+          <w:b/>
+          <w:bCs/>
+          <w:color w:val="2D3748"/>
+          <w:sz w:val="22"/>
+          <w:szCs w:val="22"/>
+        </w:rPr>
+        <w:t xml:space="preserve">Punt C (20, 40)</w:t>
+      </w:r>
+      <w:r>
+        <w:rPr>
+          <w:rFonts w:ascii="Arial" w:cs="Arial" w:eastAsia="Arial" w:hAnsi="Arial"/>
+          <w:color w:val="2D3748"/>
+          <w:sz w:val="22"/>
+          <w:szCs w:val="22"/>
+        </w:rPr>
+        <w:t xml:space="preserve"> — de monopolieprijs, afgelezen op de vraaglijn bij Q = 20.</w:t>
+      </w:r>
+    </w:p>
+    <w:p>
+      <w:pPr>
+        <w:pStyle w:val="ListParagraph"/>
+        <w:numPr>
+          <w:ilvl w:val="0"/>
+          <w:numId w:val="1"/>
+        </w:numPr>
+        <w:spacing w:after="80"/>
+      </w:pPr>
+      <w:r>
+        <w:rPr>
+          <w:rFonts w:ascii="Arial" w:cs="Arial" w:eastAsia="Arial" w:hAnsi="Arial"/>
+          <w:b/>
+          <w:bCs/>
+          <w:color w:val="D9534F"/>
+          <w:sz w:val="22"/>
+          <w:szCs w:val="22"/>
+        </w:rPr>
+        <w:t xml:space="preserve">Driehoek C-B-A</w:t>
+      </w:r>
+      <w:r>
+        <w:rPr>
+          <w:rFonts w:ascii="Arial" w:cs="Arial" w:eastAsia="Arial" w:hAnsi="Arial"/>
+          <w:color w:val="2D3748"/>
+          <w:sz w:val="22"/>
+          <w:szCs w:val="22"/>
+        </w:rPr>
+        <w:t xml:space="preserve"> is de Harbergerdriehoek: surplus dat bij VC wél bestond maar door de lagere productie van de monopolist volledig verdwijnt. Niemand krijgt het.</w:t>
+      </w:r>
+    </w:p>
+    <w:p>
+      <w:pPr>
+        <w:spacing w:after="40"/>
       </w:pPr>
     </w:p>
     <w:tbl>
@@ -3130,7 +3197,7 @@
                 <w:sz w:val="22"/>
                 <w:szCs w:val="22"/>
               </w:rPr>
-              <w:t xml:space="preserve">De Harbergerdriehoek is NIET het verschil in CS. Het is het netto verlies aan totaal surplus. Een deel van het CS verschuift naar de producent (wordt PS), maar de driehoek verdwijnt volledig.</w:t>
+              <w:t xml:space="preserve">Er vindt óók een herverdeling plaats: een deel van het vroegere CS wordt PS (de monopolist rekent een hogere prijs). Maar dat is geen welvaartsverlies — het verschuift alleen. De driehoek is wat écht weg is.</w:t>
             </w:r>
           </w:p>
         </w:tc>
@@ -3138,133 +3205,7 @@
     </w:tbl>
     <w:p>
       <w:pPr>
-        <w:spacing w:after="60"/>
-      </w:pPr>
-    </w:p>
-    <w:tbl>
-      <w:tblPr>
-        <w:tblW w:type="dxa" w:w="9026"/>
-        <w:tblBorders>
-          <w:top w:val="single" w:color="auto" w:sz="4"/>
-          <w:left w:val="single" w:color="auto" w:sz="4"/>
-          <w:bottom w:val="single" w:color="auto" w:sz="4"/>
-          <w:right w:val="single" w:color="auto" w:sz="4"/>
-          <w:insideH w:val="single" w:color="auto" w:sz="4"/>
-          <w:insideV w:val="single" w:color="auto" w:sz="4"/>
-        </w:tblBorders>
-      </w:tblPr>
-      <w:tblGrid>
-        <w:gridCol w:w="9026"/>
-      </w:tblGrid>
-      <w:tr>
-        <w:tc>
-          <w:tcPr>
-            <w:tcW w:type="dxa" w:w="9026"/>
-            <w:tcBorders>
-              <w:top w:val="single" w:color="FEF5E7" w:sz="1"/>
-              <w:left w:val="single" w:color="E67E22" w:sz="12"/>
-              <w:bottom w:val="single" w:color="FEF5E7" w:sz="1"/>
-              <w:right w:val="single" w:color="FEF5E7" w:sz="1"/>
-            </w:tcBorders>
-            <w:shd w:fill="FEF5E7" w:val="clear"/>
-            <w:tcMar>
-              <w:top w:type="dxa" w:w="120"/>
-              <w:left w:type="dxa" w:w="200"/>
-              <w:bottom w:type="dxa" w:w="120"/>
-              <w:right w:type="dxa" w:w="200"/>
-            </w:tcMar>
-          </w:tcPr>
-          <w:p>
-            <w:r>
-              <w:rPr>
-                <w:rFonts w:ascii="Arial" w:cs="Arial" w:eastAsia="Arial" w:hAnsi="Arial"/>
-                <w:b/>
-                <w:bCs/>
-                <w:color w:val="E67E22"/>
-                <w:sz w:val="22"/>
-                <w:szCs w:val="22"/>
-              </w:rPr>
-              <w:t xml:space="preserve">⭐ Kernregel: </w:t>
-            </w:r>
-            <w:r>
-              <w:rPr>
-                <w:rFonts w:ascii="Arial" w:cs="Arial" w:eastAsia="Arial" w:hAnsi="Arial"/>
-                <w:color w:val="2D3748"/>
-                <w:sz w:val="22"/>
-                <w:szCs w:val="22"/>
-              </w:rPr>
-              <w:t xml:space="preserve">De Harbergerdriehoek meet het welvaartsverlies: surplus dat niemand meer krijgt door monopoliemacht.</w:t>
-            </w:r>
-          </w:p>
-        </w:tc>
-      </w:tr>
-    </w:tbl>
-    <w:p>
-      <w:pPr>
-        <w:spacing w:after="60"/>
-      </w:pPr>
-    </w:p>
-    <w:tbl>
-      <w:tblPr>
-        <w:tblW w:type="dxa" w:w="9026"/>
-        <w:tblBorders>
-          <w:top w:val="single" w:color="auto" w:sz="4"/>
-          <w:left w:val="single" w:color="auto" w:sz="4"/>
-          <w:bottom w:val="single" w:color="auto" w:sz="4"/>
-          <w:right w:val="single" w:color="auto" w:sz="4"/>
-          <w:insideH w:val="single" w:color="auto" w:sz="4"/>
-          <w:insideV w:val="single" w:color="auto" w:sz="4"/>
-        </w:tblBorders>
-      </w:tblPr>
-      <w:tblGrid>
-        <w:gridCol w:w="9026"/>
-      </w:tblGrid>
-      <w:tr>
-        <w:tc>
-          <w:tcPr>
-            <w:tcW w:type="dxa" w:w="9026"/>
-            <w:tcBorders>
-              <w:top w:val="single" w:color="E8F5E9" w:sz="1"/>
-              <w:left w:val="single" w:color="1E8449" w:sz="12"/>
-              <w:bottom w:val="single" w:color="E8F5E9" w:sz="1"/>
-              <w:right w:val="single" w:color="E8F5E9" w:sz="1"/>
-            </w:tcBorders>
-            <w:shd w:fill="E8F5E9" w:val="clear"/>
-            <w:tcMar>
-              <w:top w:type="dxa" w:w="120"/>
-              <w:left w:type="dxa" w:w="200"/>
-              <w:bottom w:type="dxa" w:w="120"/>
-              <w:right w:type="dxa" w:w="200"/>
-            </w:tcMar>
-          </w:tcPr>
-          <w:p>
-            <w:r>
-              <w:rPr>
-                <w:rFonts w:ascii="Arial" w:cs="Arial" w:eastAsia="Arial" w:hAnsi="Arial"/>
-                <w:b/>
-                <w:bCs/>
-                <w:color w:val="1E8449"/>
-                <w:sz w:val="22"/>
-                <w:szCs w:val="22"/>
-              </w:rPr>
-              <w:t xml:space="preserve">✅ Controle: </w:t>
-            </w:r>
-            <w:r>
-              <w:rPr>
-                <w:rFonts w:ascii="Arial" w:cs="Arial" w:eastAsia="Arial" w:hAnsi="Arial"/>
-                <w:color w:val="2D3748"/>
-                <w:sz w:val="22"/>
-                <w:szCs w:val="22"/>
-              </w:rPr>
-              <w:t xml:space="preserve">Kun je de Harbergerdriehoek aanwijzen in een grafiek en de oppervlakte berekenen?</w:t>
-            </w:r>
-          </w:p>
-        </w:tc>
-      </w:tr>
-    </w:tbl>
-    <w:p>
-      <w:pPr>
-        <w:spacing w:after="60"/>
+        <w:spacing w:after="40"/>
       </w:pPr>
     </w:p>
     <w:tbl>
@@ -3345,7 +3286,7 @@
                 <w:sz w:val="20"/>
                 <w:szCs w:val="20"/>
               </w:rPr>
-              <w:t xml:space="preserve">Harbergerdriehoek</w:t>
+              <w:t xml:space="preserve">Formule</w:t>
             </w:r>
           </w:p>
         </w:tc>
@@ -3374,7 +3315,7 @@
                 <w:sz w:val="20"/>
                 <w:szCs w:val="20"/>
               </w:rPr>
-              <w:t xml:space="preserve">Welvaartsverlies door monopoliemacht</w:t>
+              <w:t xml:space="preserve">DWL = ½ × (Q_vc − Q_m) × (P_m − MK_m)</w:t>
             </w:r>
           </w:p>
         </w:tc>
@@ -3407,7 +3348,7 @@
                 <w:sz w:val="20"/>
                 <w:szCs w:val="20"/>
               </w:rPr>
-              <w:t xml:space="preserve">Formule</w:t>
+              <w:t xml:space="preserve">Grafisch</w:t>
             </w:r>
           </w:p>
         </w:tc>
@@ -3436,7 +3377,7 @@
                 <w:sz w:val="20"/>
                 <w:szCs w:val="20"/>
               </w:rPr>
-              <w:t xml:space="preserve">½ × (Q_vc − Q_m) × (P_m − MK_m)</w:t>
+              <w:t xml:space="preserve">Driehoek C-B-A (tussen V, MK, bij Q_m)</w:t>
             </w:r>
           </w:p>
         </w:tc>
@@ -3469,7 +3410,7 @@
                 <w:sz w:val="20"/>
                 <w:szCs w:val="20"/>
               </w:rPr>
-              <w:t xml:space="preserve">Betekenis</w:t>
+              <w:t xml:space="preserve">Rekenvoorbeeld</w:t>
             </w:r>
           </w:p>
         </w:tc>
@@ -3498,7 +3439,69 @@
                 <w:sz w:val="20"/>
                 <w:szCs w:val="20"/>
               </w:rPr>
-              <w:t xml:space="preserve">Surplus dat niemand meer krijgt</w:t>
+              <w:t xml:space="preserve">½ × 10 × 20 = 100</w:t>
+            </w:r>
+          </w:p>
+        </w:tc>
+      </w:tr>
+      <w:tr>
+        <w:tc>
+          <w:tcPr>
+            <w:tcW w:type="dxa" w:w="2527"/>
+            <w:tcBorders>
+              <w:top w:val="single" w:color="E2E8F0" w:sz="1"/>
+              <w:left w:val="single" w:color="E2E8F0" w:sz="1"/>
+              <w:bottom w:val="single" w:color="E2E8F0" w:sz="1"/>
+              <w:right w:val="single" w:color="E2E8F0" w:sz="1"/>
+            </w:tcBorders>
+            <w:shd w:fill="FFFFFF" w:val="clear"/>
+            <w:tcMar>
+              <w:top w:type="dxa" w:w="80"/>
+              <w:left w:type="dxa" w:w="140"/>
+              <w:bottom w:type="dxa" w:w="80"/>
+              <w:right w:type="dxa" w:w="140"/>
+            </w:tcMar>
+          </w:tcPr>
+          <w:p>
+            <w:r>
+              <w:rPr>
+                <w:rFonts w:ascii="Arial" w:cs="Arial" w:eastAsia="Arial" w:hAnsi="Arial"/>
+                <w:b/>
+                <w:bCs/>
+                <w:color w:val="1A5276"/>
+                <w:sz w:val="20"/>
+                <w:szCs w:val="20"/>
+              </w:rPr>
+              <w:t xml:space="preserve">Betekenis</w:t>
+            </w:r>
+          </w:p>
+        </w:tc>
+        <w:tc>
+          <w:tcPr>
+            <w:tcW w:type="dxa" w:w="6499"/>
+            <w:tcBorders>
+              <w:top w:val="single" w:color="E2E8F0" w:sz="1"/>
+              <w:left w:val="single" w:color="E2E8F0" w:sz="1"/>
+              <w:bottom w:val="single" w:color="E2E8F0" w:sz="1"/>
+              <w:right w:val="single" w:color="E2E8F0" w:sz="1"/>
+            </w:tcBorders>
+            <w:shd w:fill="FFFFFF" w:val="clear"/>
+            <w:tcMar>
+              <w:top w:type="dxa" w:w="80"/>
+              <w:left w:type="dxa" w:w="140"/>
+              <w:bottom w:type="dxa" w:w="80"/>
+              <w:right w:type="dxa" w:w="140"/>
+            </w:tcMar>
+          </w:tcPr>
+          <w:p>
+            <w:r>
+              <w:rPr>
+                <w:rFonts w:ascii="Arial" w:cs="Arial" w:eastAsia="Arial" w:hAnsi="Arial"/>
+                <w:color w:val="2D3748"/>
+                <w:sz w:val="20"/>
+                <w:szCs w:val="20"/>
+              </w:rPr>
+              <w:t xml:space="preserve">Surplus dat niemand krijgt — transacties die niet plaatsvinden</w:t>
             </w:r>
           </w:p>
         </w:tc>
@@ -3755,7 +3758,21 @@
                 <w:sz w:val="22"/>
                 <w:szCs w:val="22"/>
               </w:rPr>
-              <w:t xml:space="preserve">Stap 3: Vergelijk: TS_vc − TS_m = Harbergerdriehoek</w:t>
+              <w:t xml:space="preserve">Stap 3: Bereken TS = CS + PS voor beide marktvormen</w:t>
+            </w:r>
+          </w:p>
+          <w:p>
+            <w:pPr>
+              <w:spacing w:after="60"/>
+            </w:pPr>
+            <w:r>
+              <w:rPr>
+                <w:rFonts w:ascii="Consolas" w:cs="Consolas" w:eastAsia="Consolas" w:hAnsi="Consolas"/>
+                <w:color w:val="2D3748"/>
+                <w:sz w:val="22"/>
+                <w:szCs w:val="22"/>
+              </w:rPr>
+              <w:t xml:space="preserve">Stap 4: Vergelijk: TS_vc − TS_m = Harbergerdriehoek</w:t>
             </w:r>
           </w:p>
         </w:tc>
@@ -3827,7 +3844,7 @@
                 <w:sz w:val="22"/>
                 <w:szCs w:val="22"/>
               </w:rPr>
-              <w:t xml:space="preserve">Volkomen concurrentie: CS = 450, PS = 450, TS = 900</w:t>
+              <w:t xml:space="preserve">Volkomen concurrentie:</w:t>
             </w:r>
           </w:p>
           <w:p>
@@ -3841,7 +3858,7 @@
                 <w:sz w:val="22"/>
                 <w:szCs w:val="22"/>
               </w:rPr>
-              <w:t xml:space="preserve">Monopolie: CS = 200, PS = 600, TS = 800</w:t>
+              <w:t xml:space="preserve">  CS = ½ × 30 × 30 = 450</w:t>
             </w:r>
           </w:p>
           <w:p>
@@ -3855,7 +3872,161 @@
                 <w:sz w:val="22"/>
                 <w:szCs w:val="22"/>
               </w:rPr>
-              <w:t xml:space="preserve">Verschil: 900 − 800 = 100 (= Harbergerdriehoek)</w:t>
+              <w:t xml:space="preserve">  PS = ½ × 30 × 30 = 450</w:t>
+            </w:r>
+          </w:p>
+          <w:p>
+            <w:pPr>
+              <w:spacing w:after="60"/>
+            </w:pPr>
+            <w:r>
+              <w:rPr>
+                <w:rFonts w:ascii="Consolas" w:cs="Consolas" w:eastAsia="Consolas" w:hAnsi="Consolas"/>
+                <w:color w:val="2D3748"/>
+                <w:sz w:val="22"/>
+                <w:szCs w:val="22"/>
+              </w:rPr>
+              <w:t xml:space="preserve">  TS = 450 + 450 = 900</w:t>
+            </w:r>
+          </w:p>
+          <w:p>
+            <w:pPr>
+              <w:spacing w:after="60"/>
+            </w:pPr>
+            <w:r>
+              <w:rPr>
+                <w:rFonts w:ascii="Consolas" w:cs="Consolas" w:eastAsia="Consolas" w:hAnsi="Consolas"/>
+                <w:color w:val="2D3748"/>
+                <w:sz w:val="22"/>
+                <w:szCs w:val="22"/>
+              </w:rPr>
+              <w:t xml:space="preserve"/>
+            </w:r>
+          </w:p>
+          <w:p>
+            <w:pPr>
+              <w:spacing w:after="60"/>
+            </w:pPr>
+            <w:r>
+              <w:rPr>
+                <w:rFonts w:ascii="Consolas" w:cs="Consolas" w:eastAsia="Consolas" w:hAnsi="Consolas"/>
+                <w:color w:val="2D3748"/>
+                <w:sz w:val="22"/>
+                <w:szCs w:val="22"/>
+              </w:rPr>
+              <w:t xml:space="preserve">Monopolie (Q_m = 20, P_m = 40):</w:t>
+            </w:r>
+          </w:p>
+          <w:p>
+            <w:pPr>
+              <w:spacing w:after="60"/>
+            </w:pPr>
+            <w:r>
+              <w:rPr>
+                <w:rFonts w:ascii="Consolas" w:cs="Consolas" w:eastAsia="Consolas" w:hAnsi="Consolas"/>
+                <w:color w:val="2D3748"/>
+                <w:sz w:val="22"/>
+                <w:szCs w:val="22"/>
+              </w:rPr>
+              <w:t xml:space="preserve">  CS = ½ × 20 × (60 − 40) = 200</w:t>
+            </w:r>
+          </w:p>
+          <w:p>
+            <w:pPr>
+              <w:spacing w:after="60"/>
+            </w:pPr>
+            <w:r>
+              <w:rPr>
+                <w:rFonts w:ascii="Consolas" w:cs="Consolas" w:eastAsia="Consolas" w:hAnsi="Consolas"/>
+                <w:color w:val="2D3748"/>
+                <w:sz w:val="22"/>
+                <w:szCs w:val="22"/>
+              </w:rPr>
+              <w:t xml:space="preserve">  PS = ½ × 20 × 40 + ½ × 20 × 20 ... nee:</w:t>
+            </w:r>
+          </w:p>
+          <w:p>
+            <w:pPr>
+              <w:spacing w:after="60"/>
+            </w:pPr>
+            <w:r>
+              <w:rPr>
+                <w:rFonts w:ascii="Consolas" w:cs="Consolas" w:eastAsia="Consolas" w:hAnsi="Consolas"/>
+                <w:color w:val="2D3748"/>
+                <w:sz w:val="22"/>
+                <w:szCs w:val="22"/>
+              </w:rPr>
+              <w:t xml:space="preserve">  PS = oppervlakte onder P_m, boven MK, van 0 tot Q_m</w:t>
+            </w:r>
+          </w:p>
+          <w:p>
+            <w:pPr>
+              <w:spacing w:after="60"/>
+            </w:pPr>
+            <w:r>
+              <w:rPr>
+                <w:rFonts w:ascii="Consolas" w:cs="Consolas" w:eastAsia="Consolas" w:hAnsi="Consolas"/>
+                <w:color w:val="2D3748"/>
+                <w:sz w:val="22"/>
+                <w:szCs w:val="22"/>
+              </w:rPr>
+              <w:t xml:space="preserve">     = rechthoek (40 − 20) × 20 + driehoek ½ × 20 × 20</w:t>
+            </w:r>
+          </w:p>
+          <w:p>
+            <w:pPr>
+              <w:spacing w:after="60"/>
+            </w:pPr>
+            <w:r>
+              <w:rPr>
+                <w:rFonts w:ascii="Consolas" w:cs="Consolas" w:eastAsia="Consolas" w:hAnsi="Consolas"/>
+                <w:color w:val="2D3748"/>
+                <w:sz w:val="22"/>
+                <w:szCs w:val="22"/>
+              </w:rPr>
+              <w:t xml:space="preserve">     = 400 + 200 = 600</w:t>
+            </w:r>
+          </w:p>
+          <w:p>
+            <w:pPr>
+              <w:spacing w:after="60"/>
+            </w:pPr>
+            <w:r>
+              <w:rPr>
+                <w:rFonts w:ascii="Consolas" w:cs="Consolas" w:eastAsia="Consolas" w:hAnsi="Consolas"/>
+                <w:color w:val="2D3748"/>
+                <w:sz w:val="22"/>
+                <w:szCs w:val="22"/>
+              </w:rPr>
+              <w:t xml:space="preserve">  TS = 200 + 600 = 800</w:t>
+            </w:r>
+          </w:p>
+          <w:p>
+            <w:pPr>
+              <w:spacing w:after="60"/>
+            </w:pPr>
+            <w:r>
+              <w:rPr>
+                <w:rFonts w:ascii="Consolas" w:cs="Consolas" w:eastAsia="Consolas" w:hAnsi="Consolas"/>
+                <w:color w:val="2D3748"/>
+                <w:sz w:val="22"/>
+                <w:szCs w:val="22"/>
+              </w:rPr>
+              <w:t xml:space="preserve"/>
+            </w:r>
+          </w:p>
+          <w:p>
+            <w:pPr>
+              <w:spacing w:after="60"/>
+            </w:pPr>
+            <w:r>
+              <w:rPr>
+                <w:rFonts w:ascii="Consolas" w:cs="Consolas" w:eastAsia="Consolas" w:hAnsi="Consolas"/>
+                <w:color w:val="2D3748"/>
+                <w:sz w:val="22"/>
+                <w:szCs w:val="22"/>
+              </w:rPr>
+              <w:t xml:space="preserve">Welvaartsverlies = 900 − 800 = 100 = Harbergerdriehoek</w:t>
             </w:r>
           </w:p>
         </w:tc>
@@ -3863,7 +4034,7 @@
     </w:tbl>
     <w:p>
       <w:pPr>
-        <w:spacing w:after="60"/>
+        <w:spacing w:after="40"/>
       </w:pPr>
     </w:p>
     <w:tbl>
@@ -3886,12 +4057,12 @@
           <w:tcPr>
             <w:tcW w:type="dxa" w:w="9026"/>
             <w:tcBorders>
-              <w:top w:val="single" w:color="FEF5E7" w:sz="1"/>
-              <w:left w:val="single" w:color="E67E22" w:sz="12"/>
-              <w:bottom w:val="single" w:color="FEF5E7" w:sz="1"/>
-              <w:right w:val="single" w:color="FEF5E7" w:sz="1"/>
-            </w:tcBorders>
-            <w:shd w:fill="FEF5E7" w:val="clear"/>
+              <w:top w:val="single" w:color="E8F5E9" w:sz="1"/>
+              <w:left w:val="single" w:color="1E8449" w:sz="12"/>
+              <w:bottom w:val="single" w:color="E8F5E9" w:sz="1"/>
+              <w:right w:val="single" w:color="E8F5E9" w:sz="1"/>
+            </w:tcBorders>
+            <w:shd w:fill="E8F5E9" w:val="clear"/>
             <w:tcMar>
               <w:top w:type="dxa" w:w="120"/>
               <w:left w:type="dxa" w:w="200"/>
@@ -3905,20 +4076,20 @@
                 <w:rFonts w:ascii="Arial" w:cs="Arial" w:eastAsia="Arial" w:hAnsi="Arial"/>
                 <w:b/>
                 <w:bCs/>
-                <w:color w:val="E67E22"/>
-                <w:sz w:val="22"/>
-                <w:szCs w:val="22"/>
-              </w:rPr>
-              <w:t xml:space="preserve">⭐ Kernregel: </w:t>
-            </w:r>
-            <w:r>
-              <w:rPr>
-                <w:rFonts w:ascii="Arial" w:cs="Arial" w:eastAsia="Arial" w:hAnsi="Arial"/>
-                <w:color w:val="2D3748"/>
-                <w:sz w:val="22"/>
-                <w:szCs w:val="22"/>
-              </w:rPr>
-              <w:t xml:space="preserve">TS bij volkomen concurrentie is altijd groter dan of gelijk aan TS bij monopolie. Het verschil is de Harbergerdriehoek.</w:t>
+                <w:color w:val="1E8449"/>
+                <w:sz w:val="22"/>
+                <w:szCs w:val="22"/>
+              </w:rPr>
+              <w:t xml:space="preserve">✅ Controle: </w:t>
+            </w:r>
+            <w:r>
+              <w:rPr>
+                <w:rFonts w:ascii="Arial" w:cs="Arial" w:eastAsia="Arial" w:hAnsi="Arial"/>
+                <w:color w:val="2D3748"/>
+                <w:sz w:val="22"/>
+                <w:szCs w:val="22"/>
+              </w:rPr>
+              <w:t xml:space="preserve">De daling van het CS (−250) is groter dan de stijging van het PS (+150). Het verschil (100) is de Harbergerdriehoek.</w:t>
             </w:r>
           </w:p>
         </w:tc>
@@ -3926,133 +4097,7 @@
     </w:tbl>
     <w:p>
       <w:pPr>
-        <w:spacing w:after="60"/>
-      </w:pPr>
-    </w:p>
-    <w:tbl>
-      <w:tblPr>
-        <w:tblW w:type="dxa" w:w="9026"/>
-        <w:tblBorders>
-          <w:top w:val="single" w:color="auto" w:sz="4"/>
-          <w:left w:val="single" w:color="auto" w:sz="4"/>
-          <w:bottom w:val="single" w:color="auto" w:sz="4"/>
-          <w:right w:val="single" w:color="auto" w:sz="4"/>
-          <w:insideH w:val="single" w:color="auto" w:sz="4"/>
-          <w:insideV w:val="single" w:color="auto" w:sz="4"/>
-        </w:tblBorders>
-      </w:tblPr>
-      <w:tblGrid>
-        <w:gridCol w:w="9026"/>
-      </w:tblGrid>
-      <w:tr>
-        <w:tc>
-          <w:tcPr>
-            <w:tcW w:type="dxa" w:w="9026"/>
-            <w:tcBorders>
-              <w:top w:val="single" w:color="FDE8E8" w:sz="1"/>
-              <w:left w:val="single" w:color="D9534F" w:sz="12"/>
-              <w:bottom w:val="single" w:color="FDE8E8" w:sz="1"/>
-              <w:right w:val="single" w:color="FDE8E8" w:sz="1"/>
-            </w:tcBorders>
-            <w:shd w:fill="FDE8E8" w:val="clear"/>
-            <w:tcMar>
-              <w:top w:type="dxa" w:w="120"/>
-              <w:left w:type="dxa" w:w="200"/>
-              <w:bottom w:type="dxa" w:w="120"/>
-              <w:right w:type="dxa" w:w="200"/>
-            </w:tcMar>
-          </w:tcPr>
-          <w:p>
-            <w:r>
-              <w:rPr>
-                <w:rFonts w:ascii="Arial" w:cs="Arial" w:eastAsia="Arial" w:hAnsi="Arial"/>
-                <w:b/>
-                <w:bCs/>
-                <w:color w:val="D9534F"/>
-                <w:sz w:val="22"/>
-                <w:szCs w:val="22"/>
-              </w:rPr>
-              <w:t xml:space="preserve">⚠ Let op: </w:t>
-            </w:r>
-            <w:r>
-              <w:rPr>
-                <w:rFonts w:ascii="Arial" w:cs="Arial" w:eastAsia="Arial" w:hAnsi="Arial"/>
-                <w:color w:val="2D3748"/>
-                <w:sz w:val="22"/>
-                <w:szCs w:val="22"/>
-              </w:rPr>
-              <w:t xml:space="preserve">Als je een groter TS vindt bij monopolie dan bij VC, heb je een rekenfout gemaakt. Controleer je berekening!</w:t>
-            </w:r>
-          </w:p>
-        </w:tc>
-      </w:tr>
-    </w:tbl>
-    <w:p>
-      <w:pPr>
-        <w:spacing w:after="60"/>
-      </w:pPr>
-    </w:p>
-    <w:tbl>
-      <w:tblPr>
-        <w:tblW w:type="dxa" w:w="9026"/>
-        <w:tblBorders>
-          <w:top w:val="single" w:color="auto" w:sz="4"/>
-          <w:left w:val="single" w:color="auto" w:sz="4"/>
-          <w:bottom w:val="single" w:color="auto" w:sz="4"/>
-          <w:right w:val="single" w:color="auto" w:sz="4"/>
-          <w:insideH w:val="single" w:color="auto" w:sz="4"/>
-          <w:insideV w:val="single" w:color="auto" w:sz="4"/>
-        </w:tblBorders>
-      </w:tblPr>
-      <w:tblGrid>
-        <w:gridCol w:w="9026"/>
-      </w:tblGrid>
-      <w:tr>
-        <w:tc>
-          <w:tcPr>
-            <w:tcW w:type="dxa" w:w="9026"/>
-            <w:tcBorders>
-              <w:top w:val="single" w:color="E8F5E9" w:sz="1"/>
-              <w:left w:val="single" w:color="1E8449" w:sz="12"/>
-              <w:bottom w:val="single" w:color="E8F5E9" w:sz="1"/>
-              <w:right w:val="single" w:color="E8F5E9" w:sz="1"/>
-            </w:tcBorders>
-            <w:shd w:fill="E8F5E9" w:val="clear"/>
-            <w:tcMar>
-              <w:top w:type="dxa" w:w="120"/>
-              <w:left w:type="dxa" w:w="200"/>
-              <w:bottom w:type="dxa" w:w="120"/>
-              <w:right w:type="dxa" w:w="200"/>
-            </w:tcMar>
-          </w:tcPr>
-          <w:p>
-            <w:r>
-              <w:rPr>
-                <w:rFonts w:ascii="Arial" w:cs="Arial" w:eastAsia="Arial" w:hAnsi="Arial"/>
-                <w:b/>
-                <w:bCs/>
-                <w:color w:val="1E8449"/>
-                <w:sz w:val="22"/>
-                <w:szCs w:val="22"/>
-              </w:rPr>
-              <w:t xml:space="preserve">✅ Controle: </w:t>
-            </w:r>
-            <w:r>
-              <w:rPr>
-                <w:rFonts w:ascii="Arial" w:cs="Arial" w:eastAsia="Arial" w:hAnsi="Arial"/>
-                <w:color w:val="2D3748"/>
-                <w:sz w:val="22"/>
-                <w:szCs w:val="22"/>
-              </w:rPr>
-              <w:t xml:space="preserve">Kun je het TS berekenen bij beide marktvormen en het verschil verklaren?</w:t>
-            </w:r>
-          </w:p>
-        </w:tc>
-      </w:tr>
-    </w:tbl>
-    <w:p>
-      <w:pPr>
-        <w:spacing w:after="60"/>
+        <w:spacing w:after="40"/>
       </w:pPr>
     </w:p>
     <w:tbl>
@@ -4133,7 +4178,7 @@
                 <w:sz w:val="20"/>
                 <w:szCs w:val="20"/>
               </w:rPr>
-              <w:t xml:space="preserve">TS</w:t>
+              <w:t xml:space="preserve">TS bij VC</w:t>
             </w:r>
           </w:p>
         </w:tc>
@@ -4162,7 +4207,7 @@
                 <w:sz w:val="20"/>
                 <w:szCs w:val="20"/>
               </w:rPr>
-              <w:t xml:space="preserve">CS + PS = totale welvaart</w:t>
+              <w:t xml:space="preserve">CS 450 + PS 450 = 900</w:t>
             </w:r>
           </w:p>
         </w:tc>
@@ -4195,7 +4240,7 @@
                 <w:sz w:val="20"/>
                 <w:szCs w:val="20"/>
               </w:rPr>
-              <w:t xml:space="preserve">VC</w:t>
+              <w:t xml:space="preserve">TS bij monopolie</w:t>
             </w:r>
           </w:p>
         </w:tc>
@@ -4224,7 +4269,7 @@
                 <w:sz w:val="20"/>
                 <w:szCs w:val="20"/>
               </w:rPr>
-              <w:t xml:space="preserve">TS is maximaal (geen welvaartsverlies)</w:t>
+              <w:t xml:space="preserve">CS 200 + PS 600 = 800</w:t>
             </w:r>
           </w:p>
         </w:tc>
@@ -4257,7 +4302,7 @@
                 <w:sz w:val="20"/>
                 <w:szCs w:val="20"/>
               </w:rPr>
-              <w:t xml:space="preserve">Monopolie</w:t>
+              <w:t xml:space="preserve">Verschil</w:t>
             </w:r>
           </w:p>
         </w:tc>
@@ -4286,7 +4331,69 @@
                 <w:sz w:val="20"/>
                 <w:szCs w:val="20"/>
               </w:rPr>
-              <w:t xml:space="preserve">TS is lager door Harbergerdriehoek</w:t>
+              <w:t xml:space="preserve">100 = Harbergerdriehoek</w:t>
+            </w:r>
+          </w:p>
+        </w:tc>
+      </w:tr>
+      <w:tr>
+        <w:tc>
+          <w:tcPr>
+            <w:tcW w:type="dxa" w:w="2527"/>
+            <w:tcBorders>
+              <w:top w:val="single" w:color="E2E8F0" w:sz="1"/>
+              <w:left w:val="single" w:color="E2E8F0" w:sz="1"/>
+              <w:bottom w:val="single" w:color="E2E8F0" w:sz="1"/>
+              <w:right w:val="single" w:color="E2E8F0" w:sz="1"/>
+            </w:tcBorders>
+            <w:shd w:fill="FFFFFF" w:val="clear"/>
+            <w:tcMar>
+              <w:top w:type="dxa" w:w="80"/>
+              <w:left w:type="dxa" w:w="140"/>
+              <w:bottom w:type="dxa" w:w="80"/>
+              <w:right w:type="dxa" w:w="140"/>
+            </w:tcMar>
+          </w:tcPr>
+          <w:p>
+            <w:r>
+              <w:rPr>
+                <w:rFonts w:ascii="Arial" w:cs="Arial" w:eastAsia="Arial" w:hAnsi="Arial"/>
+                <w:b/>
+                <w:bCs/>
+                <w:color w:val="1A5276"/>
+                <w:sz w:val="20"/>
+                <w:szCs w:val="20"/>
+              </w:rPr>
+              <w:t xml:space="preserve">Conclusie</w:t>
+            </w:r>
+          </w:p>
+        </w:tc>
+        <w:tc>
+          <w:tcPr>
+            <w:tcW w:type="dxa" w:w="6499"/>
+            <w:tcBorders>
+              <w:top w:val="single" w:color="E2E8F0" w:sz="1"/>
+              <w:left w:val="single" w:color="E2E8F0" w:sz="1"/>
+              <w:bottom w:val="single" w:color="E2E8F0" w:sz="1"/>
+              <w:right w:val="single" w:color="E2E8F0" w:sz="1"/>
+            </w:tcBorders>
+            <w:shd w:fill="FFFFFF" w:val="clear"/>
+            <w:tcMar>
+              <w:top w:type="dxa" w:w="80"/>
+              <w:left w:type="dxa" w:w="140"/>
+              <w:bottom w:type="dxa" w:w="80"/>
+              <w:right w:type="dxa" w:w="140"/>
+            </w:tcMar>
+          </w:tcPr>
+          <w:p>
+            <w:r>
+              <w:rPr>
+                <w:rFonts w:ascii="Arial" w:cs="Arial" w:eastAsia="Arial" w:hAnsi="Arial"/>
+                <w:color w:val="2D3748"/>
+                <w:sz w:val="20"/>
+                <w:szCs w:val="20"/>
+              </w:rPr>
+              <w:t xml:space="preserve">CS daalt meer dan PS stijgt → netto welvaartsverlies</w:t>
             </w:r>
           </w:p>
         </w:tc>
@@ -4471,270 +4578,85 @@
         <w:t xml:space="preserve">Wanneer is een markt efficiënt?</w:t>
       </w:r>
     </w:p>
-    <w:tbl>
-      <w:tblPr>
-        <w:tblW w:type="dxa" w:w="9026"/>
-        <w:tblBorders>
-          <w:top w:val="single" w:color="auto" w:sz="4"/>
-          <w:left w:val="single" w:color="auto" w:sz="4"/>
-          <w:bottom w:val="single" w:color="auto" w:sz="4"/>
-          <w:right w:val="single" w:color="auto" w:sz="4"/>
-          <w:insideH w:val="single" w:color="auto" w:sz="4"/>
-          <w:insideV w:val="single" w:color="auto" w:sz="4"/>
-        </w:tblBorders>
-      </w:tblPr>
-      <w:tblGrid>
-        <w:gridCol w:w="2798"/>
-        <w:gridCol w:w="6228"/>
-      </w:tblGrid>
-      <w:tr>
-        <w:tc>
-          <w:tcPr>
-            <w:tcW w:type="dxa" w:w="2798"/>
-            <w:tcBorders>
-              <w:top w:val="single" w:color="1A5276" w:sz="1"/>
-              <w:left w:val="single" w:color="1A5276" w:sz="1"/>
-              <w:bottom w:val="single" w:color="1A5276" w:sz="1"/>
-              <w:right w:val="single" w:color="1A5276" w:sz="1"/>
-            </w:tcBorders>
-            <w:shd w:fill="1E2761" w:val="clear"/>
-            <w:tcMar>
-              <w:top w:type="dxa" w:w="80"/>
-              <w:left w:type="dxa" w:w="120"/>
-              <w:bottom w:type="dxa" w:w="80"/>
-              <w:right w:type="dxa" w:w="120"/>
-            </w:tcMar>
-          </w:tcPr>
-          <w:p>
-            <w:r>
-              <w:rPr>
-                <w:rFonts w:ascii="Arial" w:cs="Arial" w:eastAsia="Arial" w:hAnsi="Arial"/>
-                <w:b/>
-                <w:bCs/>
-                <w:color w:val="FFFFFF"/>
-                <w:sz w:val="22"/>
-                <w:szCs w:val="22"/>
-              </w:rPr>
-              <w:t xml:space="preserve">Begrip</w:t>
-            </w:r>
-          </w:p>
-        </w:tc>
-        <w:tc>
-          <w:tcPr>
-            <w:tcW w:type="dxa" w:w="6228"/>
-            <w:tcBorders>
-              <w:top w:val="single" w:color="1A5276" w:sz="1"/>
-              <w:left w:val="single" w:color="1A5276" w:sz="1"/>
-              <w:bottom w:val="single" w:color="1A5276" w:sz="1"/>
-              <w:right w:val="single" w:color="1A5276" w:sz="1"/>
-            </w:tcBorders>
-            <w:shd w:fill="1E2761" w:val="clear"/>
-            <w:tcMar>
-              <w:top w:type="dxa" w:w="80"/>
-              <w:left w:type="dxa" w:w="120"/>
-              <w:bottom w:type="dxa" w:w="80"/>
-              <w:right w:type="dxa" w:w="120"/>
-            </w:tcMar>
-          </w:tcPr>
-          <w:p>
-            <w:r>
-              <w:rPr>
-                <w:rFonts w:ascii="Arial" w:cs="Arial" w:eastAsia="Arial" w:hAnsi="Arial"/>
-                <w:b/>
-                <w:bCs/>
-                <w:color w:val="FFFFFF"/>
-                <w:sz w:val="22"/>
-                <w:szCs w:val="22"/>
-              </w:rPr>
-              <w:t xml:space="preserve">Betekenis</w:t>
-            </w:r>
-          </w:p>
-        </w:tc>
-      </w:tr>
-      <w:tr>
-        <w:tc>
-          <w:tcPr>
-            <w:tcW w:type="dxa" w:w="2798"/>
-            <w:tcBorders>
-              <w:top w:val="single" w:color="CCCCCC" w:sz="1"/>
-              <w:left w:val="single" w:color="CCCCCC" w:sz="1"/>
-              <w:bottom w:val="single" w:color="CCCCCC" w:sz="1"/>
-              <w:right w:val="single" w:color="CCCCCC" w:sz="1"/>
-            </w:tcBorders>
-            <w:shd w:fill="F7FAFC" w:val="clear"/>
-            <w:tcMar>
-              <w:top w:type="dxa" w:w="80"/>
-              <w:left w:type="dxa" w:w="120"/>
-              <w:bottom w:type="dxa" w:w="80"/>
-              <w:right w:type="dxa" w:w="120"/>
-            </w:tcMar>
-          </w:tcPr>
-          <w:p>
-            <w:r>
-              <w:rPr>
-                <w:rFonts w:ascii="Arial" w:cs="Arial" w:eastAsia="Arial" w:hAnsi="Arial"/>
-                <w:b/>
-                <w:bCs/>
-                <w:sz w:val="22"/>
-                <w:szCs w:val="22"/>
-              </w:rPr>
-              <w:t xml:space="preserve">P = MK</w:t>
-            </w:r>
-          </w:p>
-        </w:tc>
-        <w:tc>
-          <w:tcPr>
-            <w:tcW w:type="dxa" w:w="6228"/>
-            <w:tcBorders>
-              <w:top w:val="single" w:color="CCCCCC" w:sz="1"/>
-              <w:left w:val="single" w:color="CCCCCC" w:sz="1"/>
-              <w:bottom w:val="single" w:color="CCCCCC" w:sz="1"/>
-              <w:right w:val="single" w:color="CCCCCC" w:sz="1"/>
-            </w:tcBorders>
-            <w:shd w:fill="F7FAFC" w:val="clear"/>
-            <w:tcMar>
-              <w:top w:type="dxa" w:w="80"/>
-              <w:left w:type="dxa" w:w="120"/>
-              <w:bottom w:type="dxa" w:w="80"/>
-              <w:right w:type="dxa" w:w="120"/>
-            </w:tcMar>
-          </w:tcPr>
-          <w:p>
-            <w:r>
-              <w:rPr>
-                <w:rFonts w:ascii="Arial" w:cs="Arial" w:eastAsia="Arial" w:hAnsi="Arial"/>
-                <w:sz w:val="22"/>
-                <w:szCs w:val="22"/>
-              </w:rPr>
-              <w:t xml:space="preserve">Prijs is gelijk aan marginale kosten</w:t>
-            </w:r>
-          </w:p>
-        </w:tc>
-      </w:tr>
-      <w:tr>
-        <w:tc>
-          <w:tcPr>
-            <w:tcW w:type="dxa" w:w="2798"/>
-            <w:tcBorders>
-              <w:top w:val="single" w:color="CCCCCC" w:sz="1"/>
-              <w:left w:val="single" w:color="CCCCCC" w:sz="1"/>
-              <w:bottom w:val="single" w:color="CCCCCC" w:sz="1"/>
-              <w:right w:val="single" w:color="CCCCCC" w:sz="1"/>
-            </w:tcBorders>
-            <w:shd w:fill="FFFFFF" w:val="clear"/>
-            <w:tcMar>
-              <w:top w:type="dxa" w:w="80"/>
-              <w:left w:type="dxa" w:w="120"/>
-              <w:bottom w:type="dxa" w:w="80"/>
-              <w:right w:type="dxa" w:w="120"/>
-            </w:tcMar>
-          </w:tcPr>
-          <w:p>
-            <w:r>
-              <w:rPr>
-                <w:rFonts w:ascii="Arial" w:cs="Arial" w:eastAsia="Arial" w:hAnsi="Arial"/>
-                <w:b/>
-                <w:bCs/>
-                <w:sz w:val="22"/>
-                <w:szCs w:val="22"/>
-              </w:rPr>
-              <w:t xml:space="preserve">TS maximaal</w:t>
-            </w:r>
-          </w:p>
-        </w:tc>
-        <w:tc>
-          <w:tcPr>
-            <w:tcW w:type="dxa" w:w="6228"/>
-            <w:tcBorders>
-              <w:top w:val="single" w:color="CCCCCC" w:sz="1"/>
-              <w:left w:val="single" w:color="CCCCCC" w:sz="1"/>
-              <w:bottom w:val="single" w:color="CCCCCC" w:sz="1"/>
-              <w:right w:val="single" w:color="CCCCCC" w:sz="1"/>
-            </w:tcBorders>
-            <w:shd w:fill="FFFFFF" w:val="clear"/>
-            <w:tcMar>
-              <w:top w:type="dxa" w:w="80"/>
-              <w:left w:type="dxa" w:w="120"/>
-              <w:bottom w:type="dxa" w:w="80"/>
-              <w:right w:type="dxa" w:w="120"/>
-            </w:tcMar>
-          </w:tcPr>
-          <w:p>
-            <w:r>
-              <w:rPr>
-                <w:rFonts w:ascii="Arial" w:cs="Arial" w:eastAsia="Arial" w:hAnsi="Arial"/>
-                <w:sz w:val="22"/>
-                <w:szCs w:val="22"/>
-              </w:rPr>
-              <w:t xml:space="preserve">Geen welvaartsverlies</w:t>
-            </w:r>
-          </w:p>
-        </w:tc>
-      </w:tr>
-      <w:tr>
-        <w:tc>
-          <w:tcPr>
-            <w:tcW w:type="dxa" w:w="2798"/>
-            <w:tcBorders>
-              <w:top w:val="single" w:color="CCCCCC" w:sz="1"/>
-              <w:left w:val="single" w:color="CCCCCC" w:sz="1"/>
-              <w:bottom w:val="single" w:color="CCCCCC" w:sz="1"/>
-              <w:right w:val="single" w:color="CCCCCC" w:sz="1"/>
-            </w:tcBorders>
-            <w:shd w:fill="F7FAFC" w:val="clear"/>
-            <w:tcMar>
-              <w:top w:type="dxa" w:w="80"/>
-              <w:left w:type="dxa" w:w="120"/>
-              <w:bottom w:type="dxa" w:w="80"/>
-              <w:right w:type="dxa" w:w="120"/>
-            </w:tcMar>
-          </w:tcPr>
-          <w:p>
-            <w:r>
-              <w:rPr>
-                <w:rFonts w:ascii="Arial" w:cs="Arial" w:eastAsia="Arial" w:hAnsi="Arial"/>
-                <w:b/>
-                <w:bCs/>
-                <w:sz w:val="22"/>
-                <w:szCs w:val="22"/>
-              </w:rPr>
-              <w:t xml:space="preserve">Harberger = 0</w:t>
-            </w:r>
-          </w:p>
-        </w:tc>
-        <w:tc>
-          <w:tcPr>
-            <w:tcW w:type="dxa" w:w="6228"/>
-            <w:tcBorders>
-              <w:top w:val="single" w:color="CCCCCC" w:sz="1"/>
-              <w:left w:val="single" w:color="CCCCCC" w:sz="1"/>
-              <w:bottom w:val="single" w:color="CCCCCC" w:sz="1"/>
-              <w:right w:val="single" w:color="CCCCCC" w:sz="1"/>
-            </w:tcBorders>
-            <w:shd w:fill="F7FAFC" w:val="clear"/>
-            <w:tcMar>
-              <w:top w:type="dxa" w:w="80"/>
-              <w:left w:type="dxa" w:w="120"/>
-              <w:bottom w:type="dxa" w:w="80"/>
-              <w:right w:type="dxa" w:w="120"/>
-            </w:tcMar>
-          </w:tcPr>
-          <w:p>
-            <w:r>
-              <w:rPr>
-                <w:rFonts w:ascii="Arial" w:cs="Arial" w:eastAsia="Arial" w:hAnsi="Arial"/>
-                <w:sz w:val="22"/>
-                <w:szCs w:val="22"/>
-              </w:rPr>
-              <w:t xml:space="preserve">Geen deadweight loss</w:t>
-            </w:r>
-          </w:p>
-        </w:tc>
-      </w:tr>
-    </w:tbl>
-    <w:p>
-      <w:pPr>
+    <w:p>
+      <w:pPr>
+        <w:pStyle w:val="ListParagraph"/>
+        <w:numPr>
+          <w:ilvl w:val="0"/>
+          <w:numId w:val="1"/>
+        </w:numPr>
         <w:spacing w:after="80"/>
+      </w:pPr>
+      <w:r>
+        <w:rPr>
+          <w:rFonts w:ascii="Arial" w:cs="Arial" w:eastAsia="Arial" w:hAnsi="Arial"/>
+          <w:color w:val="2D3748"/>
+          <w:sz w:val="22"/>
+          <w:szCs w:val="22"/>
+        </w:rPr>
+        <w:t xml:space="preserve">P = MK (prijs is gelijk aan marginale kosten)</w:t>
+      </w:r>
+    </w:p>
+    <w:p>
+      <w:pPr>
+        <w:pStyle w:val="ListParagraph"/>
+        <w:numPr>
+          <w:ilvl w:val="0"/>
+          <w:numId w:val="1"/>
+        </w:numPr>
+        <w:spacing w:after="80"/>
+      </w:pPr>
+      <w:r>
+        <w:rPr>
+          <w:rFonts w:ascii="Arial" w:cs="Arial" w:eastAsia="Arial" w:hAnsi="Arial"/>
+          <w:color w:val="2D3748"/>
+          <w:sz w:val="22"/>
+          <w:szCs w:val="22"/>
+        </w:rPr>
+        <w:t xml:space="preserve">Het totaal surplus is maximaal</w:t>
+      </w:r>
+    </w:p>
+    <w:p>
+      <w:pPr>
+        <w:pStyle w:val="ListParagraph"/>
+        <w:numPr>
+          <w:ilvl w:val="0"/>
+          <w:numId w:val="1"/>
+        </w:numPr>
+        <w:spacing w:after="80"/>
+      </w:pPr>
+      <w:r>
+        <w:rPr>
+          <w:rFonts w:ascii="Arial" w:cs="Arial" w:eastAsia="Arial" w:hAnsi="Arial"/>
+          <w:color w:val="2D3748"/>
+          <w:sz w:val="22"/>
+          <w:szCs w:val="22"/>
+        </w:rPr>
+        <w:t xml:space="preserve">Er is geen welvaartsverlies (Harbergerdriehoek = 0)</w:t>
+      </w:r>
+    </w:p>
+    <w:p>
+      <w:pPr>
+        <w:pStyle w:val="ListParagraph"/>
+        <w:numPr>
+          <w:ilvl w:val="0"/>
+          <w:numId w:val="1"/>
+        </w:numPr>
+        <w:spacing w:after="80"/>
+      </w:pPr>
+      <w:r>
+        <w:rPr>
+          <w:rFonts w:ascii="Arial" w:cs="Arial" w:eastAsia="Arial" w:hAnsi="Arial"/>
+          <w:color w:val="2D3748"/>
+          <w:sz w:val="22"/>
+          <w:szCs w:val="22"/>
+        </w:rPr>
+        <w:t xml:space="preserve">Dit geldt bij volkomen concurrentie</w:t>
+      </w:r>
+    </w:p>
+    <w:p>
+      <w:pPr>
+        <w:spacing w:after="40"/>
       </w:pPr>
     </w:p>
     <w:p>
@@ -4754,270 +4676,85 @@
         <w:t xml:space="preserve">Wanneer is een markt inefficiënt?</w:t>
       </w:r>
     </w:p>
-    <w:tbl>
-      <w:tblPr>
-        <w:tblW w:type="dxa" w:w="9026"/>
-        <w:tblBorders>
-          <w:top w:val="single" w:color="auto" w:sz="4"/>
-          <w:left w:val="single" w:color="auto" w:sz="4"/>
-          <w:bottom w:val="single" w:color="auto" w:sz="4"/>
-          <w:right w:val="single" w:color="auto" w:sz="4"/>
-          <w:insideH w:val="single" w:color="auto" w:sz="4"/>
-          <w:insideV w:val="single" w:color="auto" w:sz="4"/>
-        </w:tblBorders>
-      </w:tblPr>
-      <w:tblGrid>
-        <w:gridCol w:w="2798"/>
-        <w:gridCol w:w="6228"/>
-      </w:tblGrid>
-      <w:tr>
-        <w:tc>
-          <w:tcPr>
-            <w:tcW w:type="dxa" w:w="2798"/>
-            <w:tcBorders>
-              <w:top w:val="single" w:color="1A5276" w:sz="1"/>
-              <w:left w:val="single" w:color="1A5276" w:sz="1"/>
-              <w:bottom w:val="single" w:color="1A5276" w:sz="1"/>
-              <w:right w:val="single" w:color="1A5276" w:sz="1"/>
-            </w:tcBorders>
-            <w:shd w:fill="1E2761" w:val="clear"/>
-            <w:tcMar>
-              <w:top w:type="dxa" w:w="80"/>
-              <w:left w:type="dxa" w:w="120"/>
-              <w:bottom w:type="dxa" w:w="80"/>
-              <w:right w:type="dxa" w:w="120"/>
-            </w:tcMar>
-          </w:tcPr>
-          <w:p>
-            <w:r>
-              <w:rPr>
-                <w:rFonts w:ascii="Arial" w:cs="Arial" w:eastAsia="Arial" w:hAnsi="Arial"/>
-                <w:b/>
-                <w:bCs/>
-                <w:color w:val="FFFFFF"/>
-                <w:sz w:val="22"/>
-                <w:szCs w:val="22"/>
-              </w:rPr>
-              <w:t xml:space="preserve">Begrip</w:t>
-            </w:r>
-          </w:p>
-        </w:tc>
-        <w:tc>
-          <w:tcPr>
-            <w:tcW w:type="dxa" w:w="6228"/>
-            <w:tcBorders>
-              <w:top w:val="single" w:color="1A5276" w:sz="1"/>
-              <w:left w:val="single" w:color="1A5276" w:sz="1"/>
-              <w:bottom w:val="single" w:color="1A5276" w:sz="1"/>
-              <w:right w:val="single" w:color="1A5276" w:sz="1"/>
-            </w:tcBorders>
-            <w:shd w:fill="1E2761" w:val="clear"/>
-            <w:tcMar>
-              <w:top w:type="dxa" w:w="80"/>
-              <w:left w:type="dxa" w:w="120"/>
-              <w:bottom w:type="dxa" w:w="80"/>
-              <w:right w:type="dxa" w:w="120"/>
-            </w:tcMar>
-          </w:tcPr>
-          <w:p>
-            <w:r>
-              <w:rPr>
-                <w:rFonts w:ascii="Arial" w:cs="Arial" w:eastAsia="Arial" w:hAnsi="Arial"/>
-                <w:b/>
-                <w:bCs/>
-                <w:color w:val="FFFFFF"/>
-                <w:sz w:val="22"/>
-                <w:szCs w:val="22"/>
-              </w:rPr>
-              <w:t xml:space="preserve">Betekenis</w:t>
-            </w:r>
-          </w:p>
-        </w:tc>
-      </w:tr>
-      <w:tr>
-        <w:tc>
-          <w:tcPr>
-            <w:tcW w:type="dxa" w:w="2798"/>
-            <w:tcBorders>
-              <w:top w:val="single" w:color="CCCCCC" w:sz="1"/>
-              <w:left w:val="single" w:color="CCCCCC" w:sz="1"/>
-              <w:bottom w:val="single" w:color="CCCCCC" w:sz="1"/>
-              <w:right w:val="single" w:color="CCCCCC" w:sz="1"/>
-            </w:tcBorders>
-            <w:shd w:fill="F7FAFC" w:val="clear"/>
-            <w:tcMar>
-              <w:top w:type="dxa" w:w="80"/>
-              <w:left w:type="dxa" w:w="120"/>
-              <w:bottom w:type="dxa" w:w="80"/>
-              <w:right w:type="dxa" w:w="120"/>
-            </w:tcMar>
-          </w:tcPr>
-          <w:p>
-            <w:r>
-              <w:rPr>
-                <w:rFonts w:ascii="Arial" w:cs="Arial" w:eastAsia="Arial" w:hAnsi="Arial"/>
-                <w:b/>
-                <w:bCs/>
-                <w:sz w:val="22"/>
-                <w:szCs w:val="22"/>
-              </w:rPr>
-              <w:t xml:space="preserve">P &gt; MK</w:t>
-            </w:r>
-          </w:p>
-        </w:tc>
-        <w:tc>
-          <w:tcPr>
-            <w:tcW w:type="dxa" w:w="6228"/>
-            <w:tcBorders>
-              <w:top w:val="single" w:color="CCCCCC" w:sz="1"/>
-              <w:left w:val="single" w:color="CCCCCC" w:sz="1"/>
-              <w:bottom w:val="single" w:color="CCCCCC" w:sz="1"/>
-              <w:right w:val="single" w:color="CCCCCC" w:sz="1"/>
-            </w:tcBorders>
-            <w:shd w:fill="F7FAFC" w:val="clear"/>
-            <w:tcMar>
-              <w:top w:type="dxa" w:w="80"/>
-              <w:left w:type="dxa" w:w="120"/>
-              <w:bottom w:type="dxa" w:w="80"/>
-              <w:right w:type="dxa" w:w="120"/>
-            </w:tcMar>
-          </w:tcPr>
-          <w:p>
-            <w:r>
-              <w:rPr>
-                <w:rFonts w:ascii="Arial" w:cs="Arial" w:eastAsia="Arial" w:hAnsi="Arial"/>
-                <w:sz w:val="22"/>
-                <w:szCs w:val="22"/>
-              </w:rPr>
-              <w:t xml:space="preserve">Monopolist rekent hogere prijs dan MK</w:t>
-            </w:r>
-          </w:p>
-        </w:tc>
-      </w:tr>
-      <w:tr>
-        <w:tc>
-          <w:tcPr>
-            <w:tcW w:type="dxa" w:w="2798"/>
-            <w:tcBorders>
-              <w:top w:val="single" w:color="CCCCCC" w:sz="1"/>
-              <w:left w:val="single" w:color="CCCCCC" w:sz="1"/>
-              <w:bottom w:val="single" w:color="CCCCCC" w:sz="1"/>
-              <w:right w:val="single" w:color="CCCCCC" w:sz="1"/>
-            </w:tcBorders>
-            <w:shd w:fill="FFFFFF" w:val="clear"/>
-            <w:tcMar>
-              <w:top w:type="dxa" w:w="80"/>
-              <w:left w:type="dxa" w:w="120"/>
-              <w:bottom w:type="dxa" w:w="80"/>
-              <w:right w:type="dxa" w:w="120"/>
-            </w:tcMar>
-          </w:tcPr>
-          <w:p>
-            <w:r>
-              <w:rPr>
-                <w:rFonts w:ascii="Arial" w:cs="Arial" w:eastAsia="Arial" w:hAnsi="Arial"/>
-                <w:b/>
-                <w:bCs/>
-                <w:sz w:val="22"/>
-                <w:szCs w:val="22"/>
-              </w:rPr>
-              <w:t xml:space="preserve">TS niet maximaal</w:t>
-            </w:r>
-          </w:p>
-        </w:tc>
-        <w:tc>
-          <w:tcPr>
-            <w:tcW w:type="dxa" w:w="6228"/>
-            <w:tcBorders>
-              <w:top w:val="single" w:color="CCCCCC" w:sz="1"/>
-              <w:left w:val="single" w:color="CCCCCC" w:sz="1"/>
-              <w:bottom w:val="single" w:color="CCCCCC" w:sz="1"/>
-              <w:right w:val="single" w:color="CCCCCC" w:sz="1"/>
-            </w:tcBorders>
-            <w:shd w:fill="FFFFFF" w:val="clear"/>
-            <w:tcMar>
-              <w:top w:type="dxa" w:w="80"/>
-              <w:left w:type="dxa" w:w="120"/>
-              <w:bottom w:type="dxa" w:w="80"/>
-              <w:right w:type="dxa" w:w="120"/>
-            </w:tcMar>
-          </w:tcPr>
-          <w:p>
-            <w:r>
-              <w:rPr>
-                <w:rFonts w:ascii="Arial" w:cs="Arial" w:eastAsia="Arial" w:hAnsi="Arial"/>
-                <w:sz w:val="22"/>
-                <w:szCs w:val="22"/>
-              </w:rPr>
-              <w:t xml:space="preserve">Er is welvaartsverlies</w:t>
-            </w:r>
-          </w:p>
-        </w:tc>
-      </w:tr>
-      <w:tr>
-        <w:tc>
-          <w:tcPr>
-            <w:tcW w:type="dxa" w:w="2798"/>
-            <w:tcBorders>
-              <w:top w:val="single" w:color="CCCCCC" w:sz="1"/>
-              <w:left w:val="single" w:color="CCCCCC" w:sz="1"/>
-              <w:bottom w:val="single" w:color="CCCCCC" w:sz="1"/>
-              <w:right w:val="single" w:color="CCCCCC" w:sz="1"/>
-            </w:tcBorders>
-            <w:shd w:fill="F7FAFC" w:val="clear"/>
-            <w:tcMar>
-              <w:top w:type="dxa" w:w="80"/>
-              <w:left w:type="dxa" w:w="120"/>
-              <w:bottom w:type="dxa" w:w="80"/>
-              <w:right w:type="dxa" w:w="120"/>
-            </w:tcMar>
-          </w:tcPr>
-          <w:p>
-            <w:r>
-              <w:rPr>
-                <w:rFonts w:ascii="Arial" w:cs="Arial" w:eastAsia="Arial" w:hAnsi="Arial"/>
-                <w:b/>
-                <w:bCs/>
-                <w:sz w:val="22"/>
-                <w:szCs w:val="22"/>
-              </w:rPr>
-              <w:t xml:space="preserve">Harberger &gt; 0</w:t>
-            </w:r>
-          </w:p>
-        </w:tc>
-        <w:tc>
-          <w:tcPr>
-            <w:tcW w:type="dxa" w:w="6228"/>
-            <w:tcBorders>
-              <w:top w:val="single" w:color="CCCCCC" w:sz="1"/>
-              <w:left w:val="single" w:color="CCCCCC" w:sz="1"/>
-              <w:bottom w:val="single" w:color="CCCCCC" w:sz="1"/>
-              <w:right w:val="single" w:color="CCCCCC" w:sz="1"/>
-            </w:tcBorders>
-            <w:shd w:fill="F7FAFC" w:val="clear"/>
-            <w:tcMar>
-              <w:top w:type="dxa" w:w="80"/>
-              <w:left w:type="dxa" w:w="120"/>
-              <w:bottom w:type="dxa" w:w="80"/>
-              <w:right w:type="dxa" w:w="120"/>
-            </w:tcMar>
-          </w:tcPr>
-          <w:p>
-            <w:r>
-              <w:rPr>
-                <w:rFonts w:ascii="Arial" w:cs="Arial" w:eastAsia="Arial" w:hAnsi="Arial"/>
-                <w:sz w:val="22"/>
-                <w:szCs w:val="22"/>
-              </w:rPr>
-              <w:t xml:space="preserve">Er is deadweight loss</w:t>
-            </w:r>
-          </w:p>
-        </w:tc>
-      </w:tr>
-    </w:tbl>
-    <w:p>
-      <w:pPr>
+    <w:p>
+      <w:pPr>
+        <w:pStyle w:val="ListParagraph"/>
+        <w:numPr>
+          <w:ilvl w:val="0"/>
+          <w:numId w:val="1"/>
+        </w:numPr>
         <w:spacing w:after="80"/>
+      </w:pPr>
+      <w:r>
+        <w:rPr>
+          <w:rFonts w:ascii="Arial" w:cs="Arial" w:eastAsia="Arial" w:hAnsi="Arial"/>
+          <w:color w:val="2D3748"/>
+          <w:sz w:val="22"/>
+          <w:szCs w:val="22"/>
+        </w:rPr>
+        <w:t xml:space="preserve">P &gt; MK (monopolist vraagt meer dan de marginale kosten)</w:t>
+      </w:r>
+    </w:p>
+    <w:p>
+      <w:pPr>
+        <w:pStyle w:val="ListParagraph"/>
+        <w:numPr>
+          <w:ilvl w:val="0"/>
+          <w:numId w:val="1"/>
+        </w:numPr>
+        <w:spacing w:after="80"/>
+      </w:pPr>
+      <w:r>
+        <w:rPr>
+          <w:rFonts w:ascii="Arial" w:cs="Arial" w:eastAsia="Arial" w:hAnsi="Arial"/>
+          <w:color w:val="2D3748"/>
+          <w:sz w:val="22"/>
+          <w:szCs w:val="22"/>
+        </w:rPr>
+        <w:t xml:space="preserve">Het totaal surplus is niet maximaal</w:t>
+      </w:r>
+    </w:p>
+    <w:p>
+      <w:pPr>
+        <w:pStyle w:val="ListParagraph"/>
+        <w:numPr>
+          <w:ilvl w:val="0"/>
+          <w:numId w:val="1"/>
+        </w:numPr>
+        <w:spacing w:after="80"/>
+      </w:pPr>
+      <w:r>
+        <w:rPr>
+          <w:rFonts w:ascii="Arial" w:cs="Arial" w:eastAsia="Arial" w:hAnsi="Arial"/>
+          <w:color w:val="2D3748"/>
+          <w:sz w:val="22"/>
+          <w:szCs w:val="22"/>
+        </w:rPr>
+        <w:t xml:space="preserve">Er is een Harbergerdriehoek &gt; 0</w:t>
+      </w:r>
+    </w:p>
+    <w:p>
+      <w:pPr>
+        <w:pStyle w:val="ListParagraph"/>
+        <w:numPr>
+          <w:ilvl w:val="0"/>
+          <w:numId w:val="1"/>
+        </w:numPr>
+        <w:spacing w:after="80"/>
+      </w:pPr>
+      <w:r>
+        <w:rPr>
+          <w:rFonts w:ascii="Arial" w:cs="Arial" w:eastAsia="Arial" w:hAnsi="Arial"/>
+          <w:color w:val="2D3748"/>
+          <w:sz w:val="22"/>
+          <w:szCs w:val="22"/>
+        </w:rPr>
+        <w:t xml:space="preserve">Hoge toetredingsdrempels houden de inefficiëntie in stand</w:t>
+      </w:r>
+    </w:p>
+    <w:p>
+      <w:pPr>
+        <w:spacing w:after="60"/>
       </w:pPr>
     </w:p>
     <w:p>
@@ -5067,196 +4804,7 @@
     </w:p>
     <w:p>
       <w:pPr>
-        <w:spacing w:after="60"/>
-      </w:pPr>
-    </w:p>
-    <w:tbl>
-      <w:tblPr>
-        <w:tblW w:type="dxa" w:w="9026"/>
-        <w:tblBorders>
-          <w:top w:val="single" w:color="auto" w:sz="4"/>
-          <w:left w:val="single" w:color="auto" w:sz="4"/>
-          <w:bottom w:val="single" w:color="auto" w:sz="4"/>
-          <w:right w:val="single" w:color="auto" w:sz="4"/>
-          <w:insideH w:val="single" w:color="auto" w:sz="4"/>
-          <w:insideV w:val="single" w:color="auto" w:sz="4"/>
-        </w:tblBorders>
-      </w:tblPr>
-      <w:tblGrid>
-        <w:gridCol w:w="9026"/>
-      </w:tblGrid>
-      <w:tr>
-        <w:tc>
-          <w:tcPr>
-            <w:tcW w:type="dxa" w:w="9026"/>
-            <w:tcBorders>
-              <w:top w:val="single" w:color="FEF5E7" w:sz="1"/>
-              <w:left w:val="single" w:color="E67E22" w:sz="12"/>
-              <w:bottom w:val="single" w:color="FEF5E7" w:sz="1"/>
-              <w:right w:val="single" w:color="FEF5E7" w:sz="1"/>
-            </w:tcBorders>
-            <w:shd w:fill="FEF5E7" w:val="clear"/>
-            <w:tcMar>
-              <w:top w:type="dxa" w:w="120"/>
-              <w:left w:type="dxa" w:w="200"/>
-              <w:bottom w:type="dxa" w:w="120"/>
-              <w:right w:type="dxa" w:w="200"/>
-            </w:tcMar>
-          </w:tcPr>
-          <w:p>
-            <w:r>
-              <w:rPr>
-                <w:rFonts w:ascii="Arial" w:cs="Arial" w:eastAsia="Arial" w:hAnsi="Arial"/>
-                <w:b/>
-                <w:bCs/>
-                <w:color w:val="E67E22"/>
-                <w:sz w:val="22"/>
-                <w:szCs w:val="22"/>
-              </w:rPr>
-              <w:t xml:space="preserve">⭐ Kernregel: </w:t>
-            </w:r>
-            <w:r>
-              <w:rPr>
-                <w:rFonts w:ascii="Arial" w:cs="Arial" w:eastAsia="Arial" w:hAnsi="Arial"/>
-                <w:color w:val="2D3748"/>
-                <w:sz w:val="22"/>
-                <w:szCs w:val="22"/>
-              </w:rPr>
-              <w:t xml:space="preserve">P = MK is het criterium voor efficiëntie. Als P &gt; MK, is er welvaartsverlies en is de markt inefficiënt.</w:t>
-            </w:r>
-          </w:p>
-        </w:tc>
-      </w:tr>
-    </w:tbl>
-    <w:p>
-      <w:pPr>
-        <w:spacing w:after="60"/>
-      </w:pPr>
-    </w:p>
-    <w:tbl>
-      <w:tblPr>
-        <w:tblW w:type="dxa" w:w="9026"/>
-        <w:tblBorders>
-          <w:top w:val="single" w:color="auto" w:sz="4"/>
-          <w:left w:val="single" w:color="auto" w:sz="4"/>
-          <w:bottom w:val="single" w:color="auto" w:sz="4"/>
-          <w:right w:val="single" w:color="auto" w:sz="4"/>
-          <w:insideH w:val="single" w:color="auto" w:sz="4"/>
-          <w:insideV w:val="single" w:color="auto" w:sz="4"/>
-        </w:tblBorders>
-      </w:tblPr>
-      <w:tblGrid>
-        <w:gridCol w:w="9026"/>
-      </w:tblGrid>
-      <w:tr>
-        <w:tc>
-          <w:tcPr>
-            <w:tcW w:type="dxa" w:w="9026"/>
-            <w:tcBorders>
-              <w:top w:val="single" w:color="EBF5FB" w:sz="1"/>
-              <w:left w:val="single" w:color="1A5276" w:sz="12"/>
-              <w:bottom w:val="single" w:color="EBF5FB" w:sz="1"/>
-              <w:right w:val="single" w:color="EBF5FB" w:sz="1"/>
-            </w:tcBorders>
-            <w:shd w:fill="EBF5FB" w:val="clear"/>
-            <w:tcMar>
-              <w:top w:type="dxa" w:w="120"/>
-              <w:left w:type="dxa" w:w="200"/>
-              <w:bottom w:type="dxa" w:w="120"/>
-              <w:right w:type="dxa" w:w="200"/>
-            </w:tcMar>
-          </w:tcPr>
-          <w:p>
-            <w:r>
-              <w:rPr>
-                <w:rFonts w:ascii="Arial" w:cs="Arial" w:eastAsia="Arial" w:hAnsi="Arial"/>
-                <w:b/>
-                <w:bCs/>
-                <w:color w:val="1A5276"/>
-                <w:sz w:val="22"/>
-                <w:szCs w:val="22"/>
-              </w:rPr>
-              <w:t xml:space="preserve">✨ Tip: </w:t>
-            </w:r>
-            <w:r>
-              <w:rPr>
-                <w:rFonts w:ascii="Arial" w:cs="Arial" w:eastAsia="Arial" w:hAnsi="Arial"/>
-                <w:color w:val="2D3748"/>
-                <w:sz w:val="22"/>
-                <w:szCs w:val="22"/>
-              </w:rPr>
-              <w:t xml:space="preserve">Toetredingsdrempels zijn de sleutel: als nieuwe aanbieders niet kunnen toetreden, blijft de marktmacht — en daarmee de inefficiëntie — bestaan.</w:t>
-            </w:r>
-          </w:p>
-        </w:tc>
-      </w:tr>
-    </w:tbl>
-    <w:p>
-      <w:pPr>
-        <w:spacing w:after="60"/>
-      </w:pPr>
-    </w:p>
-    <w:tbl>
-      <w:tblPr>
-        <w:tblW w:type="dxa" w:w="9026"/>
-        <w:tblBorders>
-          <w:top w:val="single" w:color="auto" w:sz="4"/>
-          <w:left w:val="single" w:color="auto" w:sz="4"/>
-          <w:bottom w:val="single" w:color="auto" w:sz="4"/>
-          <w:right w:val="single" w:color="auto" w:sz="4"/>
-          <w:insideH w:val="single" w:color="auto" w:sz="4"/>
-          <w:insideV w:val="single" w:color="auto" w:sz="4"/>
-        </w:tblBorders>
-      </w:tblPr>
-      <w:tblGrid>
-        <w:gridCol w:w="9026"/>
-      </w:tblGrid>
-      <w:tr>
-        <w:tc>
-          <w:tcPr>
-            <w:tcW w:type="dxa" w:w="9026"/>
-            <w:tcBorders>
-              <w:top w:val="single" w:color="E8F5E9" w:sz="1"/>
-              <w:left w:val="single" w:color="1E8449" w:sz="12"/>
-              <w:bottom w:val="single" w:color="E8F5E9" w:sz="1"/>
-              <w:right w:val="single" w:color="E8F5E9" w:sz="1"/>
-            </w:tcBorders>
-            <w:shd w:fill="E8F5E9" w:val="clear"/>
-            <w:tcMar>
-              <w:top w:type="dxa" w:w="120"/>
-              <w:left w:type="dxa" w:w="200"/>
-              <w:bottom w:type="dxa" w:w="120"/>
-              <w:right w:type="dxa" w:w="200"/>
-            </w:tcMar>
-          </w:tcPr>
-          <w:p>
-            <w:r>
-              <w:rPr>
-                <w:rFonts w:ascii="Arial" w:cs="Arial" w:eastAsia="Arial" w:hAnsi="Arial"/>
-                <w:b/>
-                <w:bCs/>
-                <w:color w:val="1E8449"/>
-                <w:sz w:val="22"/>
-                <w:szCs w:val="22"/>
-              </w:rPr>
-              <w:t xml:space="preserve">✅ Controle: </w:t>
-            </w:r>
-            <w:r>
-              <w:rPr>
-                <w:rFonts w:ascii="Arial" w:cs="Arial" w:eastAsia="Arial" w:hAnsi="Arial"/>
-                <w:color w:val="2D3748"/>
-                <w:sz w:val="22"/>
-                <w:szCs w:val="22"/>
-              </w:rPr>
-              <w:t xml:space="preserve">Kun je beoordelen of een markt efficiënt is aan de hand van P, MK en TS?</w:t>
-            </w:r>
-          </w:p>
-        </w:tc>
-      </w:tr>
-    </w:tbl>
-    <w:p>
-      <w:pPr>
-        <w:spacing w:after="60"/>
+        <w:spacing w:after="40"/>
       </w:pPr>
     </w:p>
     <w:tbl>
@@ -5366,7 +4914,7 @@
                 <w:sz w:val="20"/>
                 <w:szCs w:val="20"/>
               </w:rPr>
-              <w:t xml:space="preserve">P = MK, TS maximaal, Harberger = 0</w:t>
+              <w:t xml:space="preserve">P = MK, TS maximaal, geen DWL</w:t>
             </w:r>
           </w:p>
         </w:tc>
@@ -5428,7 +4976,7 @@
                 <w:sz w:val="20"/>
                 <w:szCs w:val="20"/>
               </w:rPr>
-              <w:t xml:space="preserve">P &gt; MK, TS niet maximaal, Harberger &gt; 0</w:t>
+              <w:t xml:space="preserve">P &gt; MK, TS niet maximaal, DWL &gt; 0</w:t>
             </w:r>
           </w:p>
         </w:tc>
@@ -5461,7 +5009,7 @@
                 <w:sz w:val="20"/>
                 <w:szCs w:val="20"/>
               </w:rPr>
-              <w:t xml:space="preserve">Sleutel</w:t>
+              <w:t xml:space="preserve">Oorzaak</w:t>
             </w:r>
           </w:p>
         </w:tc>
@@ -5490,7 +5038,7 @@
                 <w:sz w:val="20"/>
                 <w:szCs w:val="20"/>
               </w:rPr>
-              <w:t xml:space="preserve">Toetredingsdrempels houden inefficiëntie in stand</w:t>
+              <w:t xml:space="preserve">Marktmacht + hoge toetredingsdrempels</w:t>
             </w:r>
           </w:p>
         </w:tc>
@@ -5661,210 +5209,69 @@
         <w:t xml:space="preserve">De begrippen</w:t>
       </w:r>
     </w:p>
-    <w:tbl>
-      <w:tblPr>
-        <w:tblW w:type="dxa" w:w="9026"/>
-        <w:tblBorders>
-          <w:top w:val="single" w:color="auto" w:sz="4"/>
-          <w:left w:val="single" w:color="auto" w:sz="4"/>
-          <w:bottom w:val="single" w:color="auto" w:sz="4"/>
-          <w:right w:val="single" w:color="auto" w:sz="4"/>
-          <w:insideH w:val="single" w:color="auto" w:sz="4"/>
-          <w:insideV w:val="single" w:color="auto" w:sz="4"/>
-        </w:tblBorders>
-      </w:tblPr>
-      <w:tblGrid>
-        <w:gridCol w:w="2798"/>
-        <w:gridCol w:w="6228"/>
-      </w:tblGrid>
-      <w:tr>
-        <w:tc>
-          <w:tcPr>
-            <w:tcW w:type="dxa" w:w="2798"/>
-            <w:tcBorders>
-              <w:top w:val="single" w:color="1A5276" w:sz="1"/>
-              <w:left w:val="single" w:color="1A5276" w:sz="1"/>
-              <w:bottom w:val="single" w:color="1A5276" w:sz="1"/>
-              <w:right w:val="single" w:color="1A5276" w:sz="1"/>
-            </w:tcBorders>
-            <w:shd w:fill="1E2761" w:val="clear"/>
-            <w:tcMar>
-              <w:top w:type="dxa" w:w="80"/>
-              <w:left w:type="dxa" w:w="120"/>
-              <w:bottom w:type="dxa" w:w="80"/>
-              <w:right w:type="dxa" w:w="120"/>
-            </w:tcMar>
-          </w:tcPr>
-          <w:p>
-            <w:r>
-              <w:rPr>
-                <w:rFonts w:ascii="Arial" w:cs="Arial" w:eastAsia="Arial" w:hAnsi="Arial"/>
-                <w:b/>
-                <w:bCs/>
-                <w:color w:val="FFFFFF"/>
-                <w:sz w:val="22"/>
-                <w:szCs w:val="22"/>
-              </w:rPr>
-              <w:t xml:space="preserve">Begrip</w:t>
-            </w:r>
-          </w:p>
-        </w:tc>
-        <w:tc>
-          <w:tcPr>
-            <w:tcW w:type="dxa" w:w="6228"/>
-            <w:tcBorders>
-              <w:top w:val="single" w:color="1A5276" w:sz="1"/>
-              <w:left w:val="single" w:color="1A5276" w:sz="1"/>
-              <w:bottom w:val="single" w:color="1A5276" w:sz="1"/>
-              <w:right w:val="single" w:color="1A5276" w:sz="1"/>
-            </w:tcBorders>
-            <w:shd w:fill="1E2761" w:val="clear"/>
-            <w:tcMar>
-              <w:top w:type="dxa" w:w="80"/>
-              <w:left w:type="dxa" w:w="120"/>
-              <w:bottom w:type="dxa" w:w="80"/>
-              <w:right w:type="dxa" w:w="120"/>
-            </w:tcMar>
-          </w:tcPr>
-          <w:p>
-            <w:r>
-              <w:rPr>
-                <w:rFonts w:ascii="Arial" w:cs="Arial" w:eastAsia="Arial" w:hAnsi="Arial"/>
-                <w:b/>
-                <w:bCs/>
-                <w:color w:val="FFFFFF"/>
-                <w:sz w:val="22"/>
-                <w:szCs w:val="22"/>
-              </w:rPr>
-              <w:t xml:space="preserve">Betekenis</w:t>
-            </w:r>
-          </w:p>
-        </w:tc>
-      </w:tr>
-      <w:tr>
-        <w:tc>
-          <w:tcPr>
-            <w:tcW w:type="dxa" w:w="2798"/>
-            <w:tcBorders>
-              <w:top w:val="single" w:color="CCCCCC" w:sz="1"/>
-              <w:left w:val="single" w:color="CCCCCC" w:sz="1"/>
-              <w:bottom w:val="single" w:color="CCCCCC" w:sz="1"/>
-              <w:right w:val="single" w:color="CCCCCC" w:sz="1"/>
-            </w:tcBorders>
-            <w:shd w:fill="F7FAFC" w:val="clear"/>
-            <w:tcMar>
-              <w:top w:type="dxa" w:w="80"/>
-              <w:left w:type="dxa" w:w="120"/>
-              <w:bottom w:type="dxa" w:w="80"/>
-              <w:right w:type="dxa" w:w="120"/>
-            </w:tcMar>
-          </w:tcPr>
-          <w:p>
-            <w:r>
-              <w:rPr>
-                <w:rFonts w:ascii="Arial" w:cs="Arial" w:eastAsia="Arial" w:hAnsi="Arial"/>
-                <w:b/>
-                <w:bCs/>
-                <w:sz w:val="22"/>
-                <w:szCs w:val="22"/>
-              </w:rPr>
-              <w:t xml:space="preserve">Pareto-verbetering</w:t>
-            </w:r>
-          </w:p>
-        </w:tc>
-        <w:tc>
-          <w:tcPr>
-            <w:tcW w:type="dxa" w:w="6228"/>
-            <w:tcBorders>
-              <w:top w:val="single" w:color="CCCCCC" w:sz="1"/>
-              <w:left w:val="single" w:color="CCCCCC" w:sz="1"/>
-              <w:bottom w:val="single" w:color="CCCCCC" w:sz="1"/>
-              <w:right w:val="single" w:color="CCCCCC" w:sz="1"/>
-            </w:tcBorders>
-            <w:shd w:fill="F7FAFC" w:val="clear"/>
-            <w:tcMar>
-              <w:top w:type="dxa" w:w="80"/>
-              <w:left w:type="dxa" w:w="120"/>
-              <w:bottom w:type="dxa" w:w="80"/>
-              <w:right w:type="dxa" w:w="120"/>
-            </w:tcMar>
-          </w:tcPr>
-          <w:p>
-            <w:r>
-              <w:rPr>
-                <w:rFonts w:ascii="Arial" w:cs="Arial" w:eastAsia="Arial" w:hAnsi="Arial"/>
-                <w:sz w:val="22"/>
-                <w:szCs w:val="22"/>
-              </w:rPr>
-              <w:t xml:space="preserve">Minstens één persoon gaat erop vooruit, niemand gaat erop achteruit</w:t>
-            </w:r>
-          </w:p>
-        </w:tc>
-      </w:tr>
-      <w:tr>
-        <w:tc>
-          <w:tcPr>
-            <w:tcW w:type="dxa" w:w="2798"/>
-            <w:tcBorders>
-              <w:top w:val="single" w:color="CCCCCC" w:sz="1"/>
-              <w:left w:val="single" w:color="CCCCCC" w:sz="1"/>
-              <w:bottom w:val="single" w:color="CCCCCC" w:sz="1"/>
-              <w:right w:val="single" w:color="CCCCCC" w:sz="1"/>
-            </w:tcBorders>
-            <w:shd w:fill="FFFFFF" w:val="clear"/>
-            <w:tcMar>
-              <w:top w:type="dxa" w:w="80"/>
-              <w:left w:type="dxa" w:w="120"/>
-              <w:bottom w:type="dxa" w:w="80"/>
-              <w:right w:type="dxa" w:w="120"/>
-            </w:tcMar>
-          </w:tcPr>
-          <w:p>
-            <w:r>
-              <w:rPr>
-                <w:rFonts w:ascii="Arial" w:cs="Arial" w:eastAsia="Arial" w:hAnsi="Arial"/>
-                <w:b/>
-                <w:bCs/>
-                <w:sz w:val="22"/>
-                <w:szCs w:val="22"/>
-              </w:rPr>
-              <w:t xml:space="preserve">Pareto-efficiënt</w:t>
-            </w:r>
-          </w:p>
-        </w:tc>
-        <w:tc>
-          <w:tcPr>
-            <w:tcW w:type="dxa" w:w="6228"/>
-            <w:tcBorders>
-              <w:top w:val="single" w:color="CCCCCC" w:sz="1"/>
-              <w:left w:val="single" w:color="CCCCCC" w:sz="1"/>
-              <w:bottom w:val="single" w:color="CCCCCC" w:sz="1"/>
-              <w:right w:val="single" w:color="CCCCCC" w:sz="1"/>
-            </w:tcBorders>
-            <w:shd w:fill="FFFFFF" w:val="clear"/>
-            <w:tcMar>
-              <w:top w:type="dxa" w:w="80"/>
-              <w:left w:type="dxa" w:w="120"/>
-              <w:bottom w:type="dxa" w:w="80"/>
-              <w:right w:type="dxa" w:w="120"/>
-            </w:tcMar>
-          </w:tcPr>
-          <w:p>
-            <w:r>
-              <w:rPr>
-                <w:rFonts w:ascii="Arial" w:cs="Arial" w:eastAsia="Arial" w:hAnsi="Arial"/>
-                <w:sz w:val="22"/>
-                <w:szCs w:val="22"/>
-              </w:rPr>
-              <w:t xml:space="preserve">Er is géén Pareto-verbetering meer mogelijk</w:t>
-            </w:r>
-          </w:p>
-        </w:tc>
-      </w:tr>
-    </w:tbl>
-    <w:p>
-      <w:pPr>
+    <w:p>
+      <w:pPr>
+        <w:pStyle w:val="ListParagraph"/>
+        <w:numPr>
+          <w:ilvl w:val="0"/>
+          <w:numId w:val="1"/>
+        </w:numPr>
         <w:spacing w:after="80"/>
+      </w:pPr>
+      <w:r>
+        <w:rPr>
+          <w:rFonts w:ascii="Arial" w:cs="Arial" w:eastAsia="Arial" w:hAnsi="Arial"/>
+          <w:b/>
+          <w:bCs/>
+          <w:color w:val="2D3748"/>
+          <w:sz w:val="22"/>
+          <w:szCs w:val="22"/>
+        </w:rPr>
+        <w:t xml:space="preserve">Pareto-efficiënt: </w:t>
+      </w:r>
+      <w:r>
+        <w:rPr>
+          <w:rFonts w:ascii="Arial" w:cs="Arial" w:eastAsia="Arial" w:hAnsi="Arial"/>
+          <w:color w:val="2D3748"/>
+          <w:sz w:val="22"/>
+          <w:szCs w:val="22"/>
+        </w:rPr>
+        <w:t xml:space="preserve">een situatie waarbij het niet mogelijk is om iemand erop vooruit te laten gaan zonder dat iemand anders erop achteruitgaat.</w:t>
+      </w:r>
+    </w:p>
+    <w:p>
+      <w:pPr>
+        <w:pStyle w:val="ListParagraph"/>
+        <w:numPr>
+          <w:ilvl w:val="0"/>
+          <w:numId w:val="1"/>
+        </w:numPr>
+        <w:spacing w:after="80"/>
+      </w:pPr>
+      <w:r>
+        <w:rPr>
+          <w:rFonts w:ascii="Arial" w:cs="Arial" w:eastAsia="Arial" w:hAnsi="Arial"/>
+          <w:b/>
+          <w:bCs/>
+          <w:color w:val="2D3748"/>
+          <w:sz w:val="22"/>
+          <w:szCs w:val="22"/>
+        </w:rPr>
+        <w:t xml:space="preserve">Pareto-verbetering: </w:t>
+      </w:r>
+      <w:r>
+        <w:rPr>
+          <w:rFonts w:ascii="Arial" w:cs="Arial" w:eastAsia="Arial" w:hAnsi="Arial"/>
+          <w:color w:val="2D3748"/>
+          <w:sz w:val="22"/>
+          <w:szCs w:val="22"/>
+        </w:rPr>
+        <w:t xml:space="preserve">een verandering waarbij minstens één persoon erop vooruitgaat en niemand erop achteruitgaat.</w:t>
+      </w:r>
+    </w:p>
+    <w:p>
+      <w:pPr>
+        <w:spacing w:after="40"/>
       </w:pPr>
     </w:p>
     <w:p>
@@ -5928,7 +5335,7 @@
                 <w:sz w:val="22"/>
                 <w:szCs w:val="22"/>
               </w:rPr>
-              <w:t xml:space="preserve">Vraag: Kan iemand erop vooruitgaan zonder dat</w:t>
+              <w:t xml:space="preserve">Stap 1: Beschrijf de huidige situatie</w:t>
             </w:r>
           </w:p>
           <w:p>
@@ -5942,7 +5349,7 @@
                 <w:sz w:val="22"/>
                 <w:szCs w:val="22"/>
               </w:rPr>
-              <w:t xml:space="preserve">       iemand anders erop achteruitgaat?</w:t>
+              <w:t xml:space="preserve">Stap 2: Beschrijf de voorgestelde verandering</w:t>
             </w:r>
           </w:p>
           <w:p>
@@ -5956,7 +5363,7 @@
                 <w:sz w:val="22"/>
                 <w:szCs w:val="22"/>
               </w:rPr>
-              <w:t xml:space="preserve"/>
+              <w:t xml:space="preserve">Stap 3: Bepaal: gaat iemand erop vooruit?</w:t>
             </w:r>
           </w:p>
           <w:p>
@@ -5970,7 +5377,7 @@
                 <w:sz w:val="22"/>
                 <w:szCs w:val="22"/>
               </w:rPr>
-              <w:t xml:space="preserve">Ja  → NIET Pareto-efficiënt (verbetering is mogelijk)</w:t>
+              <w:t xml:space="preserve">Stap 4: Bepaal: gaat iemand erop achteruit?</w:t>
             </w:r>
           </w:p>
           <w:p>
@@ -5984,7 +5391,21 @@
                 <w:sz w:val="22"/>
                 <w:szCs w:val="22"/>
               </w:rPr>
-              <w:t xml:space="preserve">Nee → Wél Pareto-efficiënt (geen verbetering mogelijk)</w:t>
+              <w:t xml:space="preserve">Stap 5: Als ja op 3 en nee op 4 → Pareto-verbetering</w:t>
+            </w:r>
+          </w:p>
+          <w:p>
+            <w:pPr>
+              <w:spacing w:after="60"/>
+            </w:pPr>
+            <w:r>
+              <w:rPr>
+                <w:rFonts w:ascii="Consolas" w:cs="Consolas" w:eastAsia="Consolas" w:hAnsi="Consolas"/>
+                <w:color w:val="2D3748"/>
+                <w:sz w:val="22"/>
+                <w:szCs w:val="22"/>
+              </w:rPr>
+              <w:t xml:space="preserve">Stap 6: Als er géén verbetering meer mogelijk is → Pareto-efficiënt</w:t>
             </w:r>
           </w:p>
         </w:tc>
@@ -6042,7 +5463,7 @@
     </w:p>
     <w:p>
       <w:pPr>
-        <w:spacing w:after="60"/>
+        <w:spacing w:after="40"/>
       </w:pPr>
     </w:p>
     <w:tbl>
@@ -6097,7 +5518,7 @@
                 <w:sz w:val="22"/>
                 <w:szCs w:val="22"/>
               </w:rPr>
-              <w:t xml:space="preserve">Pareto-efficiënt betekent NIET dat de situatie eerlijk is. Een verdeling waarbij één persoon alles heeft kan Pareto-efficiënt zijn, zolang je niemand kunt verbeteren zonder de ander te verslechteren.</w:t>
+              <w:t xml:space="preserve">Pareto-efficiënt betekent niet eerlijk! Een situatie kan Pareto-efficiënt zijn terwijl één persoon alles heeft en de rest niets. Het zegt alleen dat je niemand meer kunt helpen zonder een ander te benadelen.</w:t>
             </w:r>
           </w:p>
         </w:tc>
@@ -6105,133 +5526,7 @@
     </w:tbl>
     <w:p>
       <w:pPr>
-        <w:spacing w:after="60"/>
-      </w:pPr>
-    </w:p>
-    <w:tbl>
-      <w:tblPr>
-        <w:tblW w:type="dxa" w:w="9026"/>
-        <w:tblBorders>
-          <w:top w:val="single" w:color="auto" w:sz="4"/>
-          <w:left w:val="single" w:color="auto" w:sz="4"/>
-          <w:bottom w:val="single" w:color="auto" w:sz="4"/>
-          <w:right w:val="single" w:color="auto" w:sz="4"/>
-          <w:insideH w:val="single" w:color="auto" w:sz="4"/>
-          <w:insideV w:val="single" w:color="auto" w:sz="4"/>
-        </w:tblBorders>
-      </w:tblPr>
-      <w:tblGrid>
-        <w:gridCol w:w="9026"/>
-      </w:tblGrid>
-      <w:tr>
-        <w:tc>
-          <w:tcPr>
-            <w:tcW w:type="dxa" w:w="9026"/>
-            <w:tcBorders>
-              <w:top w:val="single" w:color="FEF5E7" w:sz="1"/>
-              <w:left w:val="single" w:color="E67E22" w:sz="12"/>
-              <w:bottom w:val="single" w:color="FEF5E7" w:sz="1"/>
-              <w:right w:val="single" w:color="FEF5E7" w:sz="1"/>
-            </w:tcBorders>
-            <w:shd w:fill="FEF5E7" w:val="clear"/>
-            <w:tcMar>
-              <w:top w:type="dxa" w:w="120"/>
-              <w:left w:type="dxa" w:w="200"/>
-              <w:bottom w:type="dxa" w:w="120"/>
-              <w:right w:type="dxa" w:w="200"/>
-            </w:tcMar>
-          </w:tcPr>
-          <w:p>
-            <w:r>
-              <w:rPr>
-                <w:rFonts w:ascii="Arial" w:cs="Arial" w:eastAsia="Arial" w:hAnsi="Arial"/>
-                <w:b/>
-                <w:bCs/>
-                <w:color w:val="E67E22"/>
-                <w:sz w:val="22"/>
-                <w:szCs w:val="22"/>
-              </w:rPr>
-              <w:t xml:space="preserve">⭐ Kernregel: </w:t>
-            </w:r>
-            <w:r>
-              <w:rPr>
-                <w:rFonts w:ascii="Arial" w:cs="Arial" w:eastAsia="Arial" w:hAnsi="Arial"/>
-                <w:color w:val="2D3748"/>
-                <w:sz w:val="22"/>
-                <w:szCs w:val="22"/>
-              </w:rPr>
-              <w:t xml:space="preserve">Pareto zegt niets over eerlijkheid, alleen over de vraag of er verbeteringen mogelijk zijn.</w:t>
-            </w:r>
-          </w:p>
-        </w:tc>
-      </w:tr>
-    </w:tbl>
-    <w:p>
-      <w:pPr>
-        <w:spacing w:after="60"/>
-      </w:pPr>
-    </w:p>
-    <w:tbl>
-      <w:tblPr>
-        <w:tblW w:type="dxa" w:w="9026"/>
-        <w:tblBorders>
-          <w:top w:val="single" w:color="auto" w:sz="4"/>
-          <w:left w:val="single" w:color="auto" w:sz="4"/>
-          <w:bottom w:val="single" w:color="auto" w:sz="4"/>
-          <w:right w:val="single" w:color="auto" w:sz="4"/>
-          <w:insideH w:val="single" w:color="auto" w:sz="4"/>
-          <w:insideV w:val="single" w:color="auto" w:sz="4"/>
-        </w:tblBorders>
-      </w:tblPr>
-      <w:tblGrid>
-        <w:gridCol w:w="9026"/>
-      </w:tblGrid>
-      <w:tr>
-        <w:tc>
-          <w:tcPr>
-            <w:tcW w:type="dxa" w:w="9026"/>
-            <w:tcBorders>
-              <w:top w:val="single" w:color="E8F5E9" w:sz="1"/>
-              <w:left w:val="single" w:color="1E8449" w:sz="12"/>
-              <w:bottom w:val="single" w:color="E8F5E9" w:sz="1"/>
-              <w:right w:val="single" w:color="E8F5E9" w:sz="1"/>
-            </w:tcBorders>
-            <w:shd w:fill="E8F5E9" w:val="clear"/>
-            <w:tcMar>
-              <w:top w:type="dxa" w:w="120"/>
-              <w:left w:type="dxa" w:w="200"/>
-              <w:bottom w:type="dxa" w:w="120"/>
-              <w:right w:type="dxa" w:w="200"/>
-            </w:tcMar>
-          </w:tcPr>
-          <w:p>
-            <w:r>
-              <w:rPr>
-                <w:rFonts w:ascii="Arial" w:cs="Arial" w:eastAsia="Arial" w:hAnsi="Arial"/>
-                <w:b/>
-                <w:bCs/>
-                <w:color w:val="1E8449"/>
-                <w:sz w:val="22"/>
-                <w:szCs w:val="22"/>
-              </w:rPr>
-              <w:t xml:space="preserve">✅ Controle: </w:t>
-            </w:r>
-            <w:r>
-              <w:rPr>
-                <w:rFonts w:ascii="Arial" w:cs="Arial" w:eastAsia="Arial" w:hAnsi="Arial"/>
-                <w:color w:val="2D3748"/>
-                <w:sz w:val="22"/>
-                <w:szCs w:val="22"/>
-              </w:rPr>
-              <w:t xml:space="preserve">Kun je bij een gegeven situatie bepalen of er een Pareto-verbetering mogelijk is?</w:t>
-            </w:r>
-          </w:p>
-        </w:tc>
-      </w:tr>
-    </w:tbl>
-    <w:p>
-      <w:pPr>
-        <w:spacing w:after="60"/>
+        <w:spacing w:after="40"/>
       </w:pPr>
     </w:p>
     <w:tbl>
@@ -6341,7 +5636,7 @@
                 <w:sz w:val="20"/>
                 <w:szCs w:val="20"/>
               </w:rPr>
-              <w:t xml:space="preserve">Iemand gaat erop vooruit, niemand erop achteruit</w:t>
+              <w:t xml:space="preserve">Iemand beter af, niemand slechter af</w:t>
             </w:r>
           </w:p>
         </w:tc>
@@ -6436,7 +5731,7 @@
                 <w:sz w:val="20"/>
                 <w:szCs w:val="20"/>
               </w:rPr>
-              <w:t xml:space="preserve">Eerlijkheid</w:t>
+              <w:t xml:space="preserve">Let op</w:t>
             </w:r>
           </w:p>
         </w:tc>
@@ -6465,7 +5760,7 @@
                 <w:sz w:val="20"/>
                 <w:szCs w:val="20"/>
               </w:rPr>
-              <w:t xml:space="preserve">Pareto zegt niets over eerlijkheid</w:t>
+              <w:t xml:space="preserve">Zegt niets over verdeling of eerlijkheid</w:t>
             </w:r>
           </w:p>
         </w:tc>
@@ -6509,7 +5804,7 @@
     </w:p>
     <w:p>
       <w:pPr>
-        <w:spacing w:after="100"/>
+        <w:spacing w:after="60"/>
       </w:pPr>
     </w:p>
     <w:tbl>
@@ -6564,7 +5859,7 @@
                 <w:sz w:val="22"/>
                 <w:szCs w:val="22"/>
               </w:rPr>
-              <w:t xml:space="preserve">"De Harbergerdriehoek = het verschil in CS" → Onjuist! De driehoek is het netto verlies aan TOTAAL surplus. Een deel van het CS wordt PS.</w:t>
+              <w:t xml:space="preserve">"Meer PS bij monopolie = beter voor de markt" — Onjuist: PS stijgt, maar CS daalt meer. Het TS daalt altijd.</w:t>
             </w:r>
           </w:p>
         </w:tc>
@@ -6572,7 +5867,7 @@
     </w:tbl>
     <w:p>
       <w:pPr>
-        <w:spacing w:after="80"/>
+        <w:spacing w:after="40"/>
       </w:pPr>
     </w:p>
     <w:tbl>
@@ -6627,7 +5922,7 @@
                 <w:sz w:val="22"/>
                 <w:szCs w:val="22"/>
               </w:rPr>
-              <w:t xml:space="preserve">"Pareto-efficiënt = eerlijk" → Onjuist! Pareto zegt niets over verdeling, alleen over de vraag of er verbeteringen mogelijk zijn.</w:t>
+              <w:t xml:space="preserve">"Pareto-efficiënt = eerlijk" — Onjuist: Pareto zegt niets over verdeling.</w:t>
             </w:r>
           </w:p>
         </w:tc>
@@ -6635,7 +5930,7 @@
     </w:tbl>
     <w:p>
       <w:pPr>
-        <w:spacing w:after="80"/>
+        <w:spacing w:after="40"/>
       </w:pPr>
     </w:p>
     <w:tbl>
@@ -6690,16 +5985,79 @@
                 <w:sz w:val="22"/>
                 <w:szCs w:val="22"/>
               </w:rPr>
-              <w:t xml:space="preserve">"Meer concurrentie is altijd beter" → Genuanceerd! In de economie betekent concurrentie prijsdaling door veel aanbieders. Soms kan een monopolist door schaalvoordelen lagere kosten bereiken.</w:t>
+              <w:t xml:space="preserve">"De Harbergerdriehoek is het hele surplus dat verdwijnt" — Nee: een deel van het CS wordt PS (herverdeling), maar dat is geen verlies. Alleen de driehoek is echt weg.</w:t>
             </w:r>
           </w:p>
         </w:tc>
       </w:tr>
     </w:tbl>
     <w:p>
-      <w:r>
-        <w:br w:type="page"/>
-      </w:r>
+      <w:pPr>
+        <w:spacing w:after="40"/>
+      </w:pPr>
+    </w:p>
+    <w:tbl>
+      <w:tblPr>
+        <w:tblW w:type="dxa" w:w="9026"/>
+        <w:tblBorders>
+          <w:top w:val="single" w:color="auto" w:sz="4"/>
+          <w:left w:val="single" w:color="auto" w:sz="4"/>
+          <w:bottom w:val="single" w:color="auto" w:sz="4"/>
+          <w:right w:val="single" w:color="auto" w:sz="4"/>
+          <w:insideH w:val="single" w:color="auto" w:sz="4"/>
+          <w:insideV w:val="single" w:color="auto" w:sz="4"/>
+        </w:tblBorders>
+      </w:tblPr>
+      <w:tblGrid>
+        <w:gridCol w:w="9026"/>
+      </w:tblGrid>
+      <w:tr>
+        <w:tc>
+          <w:tcPr>
+            <w:tcW w:type="dxa" w:w="9026"/>
+            <w:tcBorders>
+              <w:top w:val="single" w:color="FDE8E8" w:sz="1"/>
+              <w:left w:val="single" w:color="D9534F" w:sz="12"/>
+              <w:bottom w:val="single" w:color="FDE8E8" w:sz="1"/>
+              <w:right w:val="single" w:color="FDE8E8" w:sz="1"/>
+            </w:tcBorders>
+            <w:shd w:fill="FDE8E8" w:val="clear"/>
+            <w:tcMar>
+              <w:top w:type="dxa" w:w="120"/>
+              <w:left w:type="dxa" w:w="200"/>
+              <w:bottom w:type="dxa" w:w="120"/>
+              <w:right w:type="dxa" w:w="200"/>
+            </w:tcMar>
+          </w:tcPr>
+          <w:p>
+            <w:r>
+              <w:rPr>
+                <w:rFonts w:ascii="Arial" w:cs="Arial" w:eastAsia="Arial" w:hAnsi="Arial"/>
+                <w:b/>
+                <w:bCs/>
+                <w:color w:val="D9534F"/>
+                <w:sz w:val="22"/>
+                <w:szCs w:val="22"/>
+              </w:rPr>
+              <w:t xml:space="preserve">⚠ Let op: </w:t>
+            </w:r>
+            <w:r>
+              <w:rPr>
+                <w:rFonts w:ascii="Arial" w:cs="Arial" w:eastAsia="Arial" w:hAnsi="Arial"/>
+                <w:color w:val="2D3748"/>
+                <w:sz w:val="22"/>
+                <w:szCs w:val="22"/>
+              </w:rPr>
+              <w:t xml:space="preserve">"De Harbergerdriehoek meet al het welvaartsverlies" — De driehoek meet het allocatieve verlies. Er kan ook dynamisch verlies zijn (minder innovatie door gebrek aan concurrentie).</w:t>
+            </w:r>
+          </w:p>
+        </w:tc>
+      </w:tr>
+    </w:tbl>
+    <w:p>
+      <w:pPr>
+        <w:spacing w:after="200"/>
+      </w:pPr>
     </w:p>
     <w:p>
       <w:pPr>
@@ -6734,7 +6092,7 @@
     </w:p>
     <w:p>
       <w:pPr>
-        <w:spacing w:after="100"/>
+        <w:spacing w:after="40"/>
       </w:pPr>
     </w:p>
     <w:p>
@@ -6788,7 +6146,7 @@
           <w:sz w:val="22"/>
           <w:szCs w:val="22"/>
         </w:rPr>
-        <w:t xml:space="preserve">Harbergerdriehoek herkennen en berekenen</w:t>
+        <w:t xml:space="preserve">Harbergerdriehoek herkennen, berekenen en verklaren</w:t>
       </w:r>
     </w:p>
     <w:p>
@@ -6842,7 +6200,7 @@
           <w:sz w:val="22"/>
           <w:szCs w:val="22"/>
         </w:rPr>
-        <w:t xml:space="preserve">Pareto-efficiëntie toepassen op een voorbeeld</w:t>
+        <w:t xml:space="preserve">Pareto-efficiëntie en Pareto-verbetering toepassen op een voorbeeld</w:t>
       </w:r>
     </w:p>
     <w:sectPr>
@@ -6851,6 +6209,7 @@
       <w:pgSz w:w="11906" w:h="16838" w:orient="portrait"/>
       <w:pgMar w:top="1440" w:right="1440" w:bottom="1440" w:left="1440" w:header="708" w:footer="708" w:gutter="0"/>
       <w:pgNumType/>
+      <w:titlePg w:val="false"/>
       <w:docGrid w:linePitch="360"/>
     </w:sectPr>
   </w:body>
@@ -6981,7 +6340,7 @@
         <w:sz w:val="18"/>
         <w:szCs w:val="18"/>
       </w:rPr>
-      <w:t xml:space="preserve">Economische doelmatigheid — Vaardigheden</w:t>
+      <w:t xml:space="preserve">3.2.6 Economische doelmatigheid — Vaardigheden</w:t>
     </w:r>
   </w:p>
 </w:hdr>

</xml_diff>